<commit_message>
Revise final paper: APA 7 citations, 1.5 spacing, justified text
Apply the course academic-writing guidelines: paragraph-level author-year
citations, APA 7 reference list on its own page with hanging indent,
third-person register outside the personal-position section, and the
requested David 12 / 1.5 line spacing / justified formatting.

Co-Authored-By: Claude Fable 5.1 <noreply@anthropic.com>
Claude-Session: https://claude.ai/code/session_01PyNnM7vakGaTMmd6pZkA5P
</commit_message>
<xml_diff>
--- a/papers/final-paper-state-budget.docx
+++ b/papers/final-paper-state-budget.docx
@@ -5,7 +5,7 @@
     <w:p>
       <w:pPr>
         <w:bidi/>
-        <w:spacing w:after="0" w:line="480" w:lineRule="auto"/>
+        <w:spacing w:after="0" w:line="360" w:lineRule="auto"/>
         <w:jc w:val="center"/>
       </w:pPr>
       <w:r>
@@ -24,7 +24,7 @@
     <w:p>
       <w:pPr>
         <w:bidi/>
-        <w:spacing w:after="0" w:line="480" w:lineRule="auto"/>
+        <w:spacing w:after="0" w:line="360" w:lineRule="auto"/>
         <w:jc w:val="center"/>
       </w:pPr>
       <w:r>
@@ -42,7 +42,7 @@
     <w:p>
       <w:pPr>
         <w:bidi/>
-        <w:spacing w:after="0" w:line="480" w:lineRule="auto"/>
+        <w:spacing w:after="0" w:line="360" w:lineRule="auto"/>
         <w:jc w:val="center"/>
       </w:pPr>
       <w:r>
@@ -60,7 +60,7 @@
     <w:p>
       <w:pPr>
         <w:bidi/>
-        <w:spacing w:after="0" w:line="480" w:lineRule="auto"/>
+        <w:spacing w:after="0" w:line="360" w:lineRule="auto"/>
         <w:jc w:val="center"/>
       </w:pPr>
       <w:r>
@@ -78,7 +78,7 @@
     <w:p>
       <w:pPr>
         <w:bidi/>
-        <w:spacing w:after="0" w:line="480" w:lineRule="auto"/>
+        <w:spacing w:after="0" w:line="360" w:lineRule="auto"/>
         <w:jc w:val="center"/>
       </w:pPr>
       <w:r>
@@ -97,7 +97,7 @@
     <w:p>
       <w:pPr>
         <w:bidi/>
-        <w:spacing w:after="0" w:line="480" w:lineRule="auto"/>
+        <w:spacing w:after="0" w:line="360" w:lineRule="auto"/>
         <w:jc w:val="center"/>
       </w:pPr>
       <w:r>
@@ -116,7 +116,7 @@
     <w:p>
       <w:pPr>
         <w:bidi/>
-        <w:spacing w:after="0" w:line="480" w:lineRule="auto"/>
+        <w:spacing w:after="0" w:line="360" w:lineRule="auto"/>
         <w:jc w:val="center"/>
       </w:pPr>
       <w:r>
@@ -134,7 +134,7 @@
     <w:p>
       <w:pPr>
         <w:bidi/>
-        <w:spacing w:after="0" w:line="480" w:lineRule="auto"/>
+        <w:spacing w:after="0" w:line="360" w:lineRule="auto"/>
         <w:jc w:val="center"/>
       </w:pPr>
       <w:r>
@@ -152,7 +152,7 @@
     <w:p>
       <w:pPr>
         <w:bidi/>
-        <w:spacing w:after="0" w:line="480" w:lineRule="auto"/>
+        <w:spacing w:after="0" w:line="360" w:lineRule="auto"/>
         <w:jc w:val="center"/>
       </w:pPr>
       <w:r>
@@ -170,7 +170,7 @@
     <w:p>
       <w:pPr>
         <w:bidi/>
-        <w:spacing w:after="0" w:line="480" w:lineRule="auto"/>
+        <w:spacing w:after="0" w:line="360" w:lineRule="auto"/>
         <w:jc w:val="center"/>
       </w:pPr>
       <w:r>
@@ -182,7 +182,7 @@
           <w:szCs w:val="24"/>
           <w:rtl/>
         </w:rPr>
-        <w:t xml:space="preserve">תאריך הגשה: ספטמבר 2026</w:t>
+        <w:t xml:space="preserve">תאריך הגשה: אלול תשפ"ו, ספטמבר 2026</w:t>
       </w:r>
     </w:p>
     <w:p>
@@ -194,7 +194,7 @@
       <w:pPr>
         <w:pStyle w:val="Heading1"/>
         <w:bidi/>
-        <w:spacing w:after="0" w:before="240" w:line="480" w:lineRule="auto"/>
+        <w:spacing w:after="120" w:before="240" w:line="360" w:lineRule="auto"/>
         <w:jc w:val="right"/>
       </w:pPr>
       <w:r>
@@ -213,7 +213,7 @@
     <w:p>
       <w:pPr>
         <w:bidi/>
-        <w:spacing w:after="0" w:before="0" w:line="480" w:lineRule="auto"/>
+        <w:spacing w:after="0" w:before="0" w:line="360" w:lineRule="auto"/>
         <w:ind w:firstLine="567"/>
         <w:jc w:val="both"/>
       </w:pPr>
@@ -226,14 +226,33 @@
           <w:szCs w:val="24"/>
           <w:rtl/>
         </w:rPr>
-        <w:t xml:space="preserve">תקציב המדינה הוא המסמך שבו הממשלה מתרגמת את סדר העדיפויות שלה למספרים: מי מקבל, מי משלם וכמה המדינה מוכנה ללוות. מאז 7 באוקטובר 2023 הפך התקציב לזירה שבה נפגשים הצורך הביטחוני הדחוף, הלחצים הפוליטיים בתוך הקואליציה ויכולת הפיקוח המוגבלת של הכנסת. בעבודה זו אתאר את שלבי גיבוש התקציב ואישורו בממשלה ובכנסת, אנתח את השינויים שחלו בתקציבי 2026-2023 בעקבות מלחמת "חרבות ברזל" ואת השלכות הגדלת תקציב הביטחון על הציבור, אציע שינויים בפיקוח הפרלמנטרי ואעריך עד כמה יש סיכוי לשנות את המצב.</w:t>
+        <w:t xml:space="preserve">תקציב המדינה הוא המסמך שבו הממשלה מתרגמת את סדר העדיפויות שלה למספרים: מי מקבל, מי משלם וכמה המדינה מוכנה ללוות. הוא כולל את אומדן ההוצאות של המשרדים, את אומדן ההכנסות ממסים ואגרות ואת יעד הגירעון, וכולם נשענים על תחזיות של צמיחה, אבטלה ושער חליפין (זרחיה, 2026א). מאז 7 באוקטובר 2023 הפך התקציב לזירה שבה נפגשים הצורך הביטחוני הדחוף, הלחצים הפוליטיים בתוך הקואליציה ויכולת הפיקוח המוגבלת של הכנסת.</w:t>
+      </w:r>
+    </w:p>
+    <w:p>
+      <w:pPr>
+        <w:bidi/>
+        <w:spacing w:after="0" w:before="0" w:line="360" w:lineRule="auto"/>
+        <w:ind w:firstLine="567"/>
+        <w:jc w:val="both"/>
+      </w:pPr>
+      <w:r>
+        <w:rPr>
+          <w:rFonts w:ascii="David" w:cs="David" w:eastAsia="David" w:hAnsi="David"/>
+          <w:b w:val="false"/>
+          <w:i w:val="false"/>
+          <w:sz w:val="24"/>
+          <w:szCs w:val="24"/>
+          <w:rtl/>
+        </w:rPr>
+        <w:t xml:space="preserve">העבודה עוסקת בארבע שאלות. הפרק הראשון מתאר את שלבי גיבוש התקציב ואישורו בממשלה ובכנסת. הפרק השני מנתח את השינויים שחלו בתקציבי 2026-2023 בעקבות מלחמת "חרבות ברזל" ואת השלכות הגדלת תקציב הביטחון על הציבור. הפרק השלישי מציע שינויים בפיקוח הפרלמנטרי, והפרק הרביעי מעריך את הסיכוי לשינוי ומציג עמדה אישית. הניתוח נשען על חומרי הקורס, על פרסומי בנק ישראל ומשרד האוצר, על ניתוחי מרכז המחקר והמידע של הכנסת ועל דוח ועדת נגל לתקציב הביטחון.</w:t>
       </w:r>
     </w:p>
     <w:p>
       <w:pPr>
         <w:pStyle w:val="Heading1"/>
         <w:bidi/>
-        <w:spacing w:after="0" w:before="240" w:line="480" w:lineRule="auto"/>
+        <w:spacing w:after="120" w:before="240" w:line="360" w:lineRule="auto"/>
         <w:jc w:val="right"/>
       </w:pPr>
       <w:r>
@@ -252,7 +271,7 @@
     <w:p>
       <w:pPr>
         <w:bidi/>
-        <w:spacing w:after="0" w:before="0" w:line="480" w:lineRule="auto"/>
+        <w:spacing w:after="0" w:before="0" w:line="360" w:lineRule="auto"/>
         <w:ind w:firstLine="567"/>
         <w:jc w:val="both"/>
       </w:pPr>
@@ -265,13 +284,13 @@
           <w:szCs w:val="24"/>
           <w:rtl/>
         </w:rPr>
-        <w:t xml:space="preserve">תהליך גיבוש התקציב בישראל הוא ריכוזי במיוחד: בהשוואה בין 27 מדינות מפותחות, ישראל ניצבת במקום הראשון במידת הריכוזיות של התהליך בידי משרד האוצר, לפני אירלנד, איסלנד, מקסיקו ואיטליה (זרחיה, 2026). ניתן לחלק את התהליך לארבעה שלבים עיקריים.</w:t>
-      </w:r>
-    </w:p>
-    <w:p>
-      <w:pPr>
-        <w:bidi/>
-        <w:spacing w:after="0" w:before="0" w:line="480" w:lineRule="auto"/>
+        <w:t xml:space="preserve">תהליך גיבוש התקציב בישראל ריכוזי במיוחד. בהשוואה בין 27 מדינות מפותחות ניצבת ישראל במקום הראשון במידת הריכוזיות של התהליך בידי משרד האוצר, לפני אירלנד, איסלנד, מקסיקו ואיטליה (זרחיה, 2026א). התהליך מתחלק לארבעה שלבים.</w:t>
+      </w:r>
+    </w:p>
+    <w:p>
+      <w:pPr>
+        <w:bidi/>
+        <w:spacing w:after="0" w:before="0" w:line="360" w:lineRule="auto"/>
         <w:ind w:firstLine="567"/>
         <w:jc w:val="both"/>
       </w:pPr>
@@ -285,24 +304,24 @@
           <w:szCs w:val="24"/>
           <w:rtl/>
         </w:rPr>
-        <w:t xml:space="preserve">שלב ראשון - גיבוש באגף התקציבים. </w:t>
-      </w:r>
-      <w:r>
-        <w:rPr>
-          <w:rFonts w:ascii="David" w:cs="David" w:eastAsia="David" w:hAnsi="David"/>
-          <w:b w:val="false"/>
-          <w:i w:val="false"/>
-          <w:sz w:val="24"/>
-          <w:szCs w:val="24"/>
-          <w:rtl/>
-        </w:rPr>
-        <w:t xml:space="preserve">אגף התקציבים במשרד האוצר בונה הצעת תקציב לכל משרד על בסיס תקציב השנה הקודמת, בתוספת השינויים שבוצעו במהלכה, מימון החלטות ממשלה וכנסת חדשות ועדכון "טייס אוטומטי" לפי הגידול הטבעי באוכלוסייה. בשלב זה נקבעים שלושת עמודי התווך של התקציב: אומדן ההוצאות של המשרדים וגופי הסמך, אומדן ההכנסות ממסים, אגרות והיטלים, ויעד הגירעון. כולם נשענים על תחזיות של צמיחה, אבטלה ושער חליפין, ולכן טעות בתחזית פירושה תקציב שנפרץ במהלך השנה.</w:t>
-      </w:r>
-    </w:p>
-    <w:p>
-      <w:pPr>
-        <w:bidi/>
-        <w:spacing w:after="0" w:before="0" w:line="480" w:lineRule="auto"/>
+        <w:t xml:space="preserve">השלב הראשון: גיבוש באגף התקציבים. </w:t>
+      </w:r>
+      <w:r>
+        <w:rPr>
+          <w:rFonts w:ascii="David" w:cs="David" w:eastAsia="David" w:hAnsi="David"/>
+          <w:b w:val="false"/>
+          <w:i w:val="false"/>
+          <w:sz w:val="24"/>
+          <w:szCs w:val="24"/>
+          <w:rtl/>
+        </w:rPr>
+        <w:t xml:space="preserve">אגף התקציבים במשרד האוצר בונה הצעת תקציב לכל משרד על בסיס תקציב השנה הקודמת, בתוספת השינויים שבוצעו במהלכה, מימון החלטות ממשלה וכנסת חדשות ועדכון "טייס אוטומטי" לפי הגידול הטבעי באוכלוסייה (זרחיה, 2026א). טעות בתחזית הצמיחה או בגביית המסים פירושה תקציב שנפרץ במהלך השנה, כפי שקרה ב-2024.</w:t>
+      </w:r>
+    </w:p>
+    <w:p>
+      <w:pPr>
+        <w:bidi/>
+        <w:spacing w:after="0" w:before="0" w:line="360" w:lineRule="auto"/>
         <w:ind w:firstLine="567"/>
         <w:jc w:val="both"/>
       </w:pPr>
@@ -316,24 +335,24 @@
           <w:szCs w:val="24"/>
           <w:rtl/>
         </w:rPr>
-        <w:t xml:space="preserve">שלב שני - אישור בממשלה. </w:t>
-      </w:r>
-      <w:r>
-        <w:rPr>
-          <w:rFonts w:ascii="David" w:cs="David" w:eastAsia="David" w:hAnsi="David"/>
-          <w:b w:val="false"/>
-          <w:i w:val="false"/>
-          <w:sz w:val="24"/>
-          <w:szCs w:val="24"/>
-          <w:rtl/>
-        </w:rPr>
-        <w:t xml:space="preserve">שר האוצר מציג את ההצעה לראש הממשלה, והממשלה מתכנסת לישיבות מיוחדות. כאן מתרחש מה שמכונה "הבזאר הטורקי": השרים מתנים את תמיכתם בהגדלת תקציבי משרדיהם במיליארדי שקלים, מתנהל משא ומתן מול פקידי האוצר, והאוצר משריין מראש "קופה קטנה" כדי להיענות לדרישות. בסוף השלב, כדי לעמוד ביעדי התקציב לאחר ההיענות, נדרשת הממשלה לבחור בין שלוש חלופות לא פופולריות: קיצוץ רוחבי הפוגע בעיקר בחינוך, בבריאות, ברווחה ובתחבורה; העלאת מסים, שהשרים אינם אוהבים; או הגדלת יעד הגירעון, מתוך חשש מתגובת חברות הדירוג הבינלאומיות.</w:t>
-      </w:r>
-    </w:p>
-    <w:p>
-      <w:pPr>
-        <w:bidi/>
-        <w:spacing w:after="0" w:before="0" w:line="480" w:lineRule="auto"/>
+        <w:t xml:space="preserve">השלב השני: אישור בממשלה. </w:t>
+      </w:r>
+      <w:r>
+        <w:rPr>
+          <w:rFonts w:ascii="David" w:cs="David" w:eastAsia="David" w:hAnsi="David"/>
+          <w:b w:val="false"/>
+          <w:i w:val="false"/>
+          <w:sz w:val="24"/>
+          <w:szCs w:val="24"/>
+          <w:rtl/>
+        </w:rPr>
+        <w:t xml:space="preserve">שר האוצר מציג את ההצעה לראש הממשלה, והממשלה מתכנסת לישיבות מיוחדות. כאן מתרחש מה שמכונה בקורס "הבזאר הטורקי": השרים מתנים את תמיכתם בהגדלת תקציבי משרדיהם במיליארדי שקלים, מתנהל משא ומתן מול פקידי האוצר, והאוצר משריין מראש "קופה קטנה" כדי להיענות לדרישות. בסוף השלב, כדי לעמוד ביעדי התקציב לאחר ההיענות, נדרשת הממשלה לבחור בין קיצוץ רוחבי הפוגע בעיקר בחינוך, בבריאות, ברווחה ובתחבורה, בין העלאת מסים שהשרים אינם אוהבים, ובין הגדלת יעד הגירעון, מתוך חשש מתגובת חברות הדירוג (זרחיה, 2026א).</w:t>
+      </w:r>
+    </w:p>
+    <w:p>
+      <w:pPr>
+        <w:bidi/>
+        <w:spacing w:after="0" w:before="0" w:line="360" w:lineRule="auto"/>
         <w:ind w:firstLine="567"/>
         <w:jc w:val="both"/>
       </w:pPr>
@@ -347,24 +366,24 @@
           <w:szCs w:val="24"/>
           <w:rtl/>
         </w:rPr>
-        <w:t xml:space="preserve">שלב שלישי - הנחה על שולחן הכנסת ודיון בוועדות. </w:t>
-      </w:r>
-      <w:r>
-        <w:rPr>
-          <w:rFonts w:ascii="David" w:cs="David" w:eastAsia="David" w:hAnsi="David"/>
-          <w:b w:val="false"/>
-          <w:i w:val="false"/>
-          <w:sz w:val="24"/>
-          <w:szCs w:val="24"/>
-          <w:rtl/>
-        </w:rPr>
-        <w:t xml:space="preserve">בשנה רגילה מונח התקציב עד 31 באוקטובר ומאושר בקריאה ראשונה בתחילת נובמבר. ועדת הכנסת מפצלת את חוק ההסדרים בין הוועדות השונות ומעבירה את חוק התקציב לוועדת הכספים, והוועדות דנות בשניהם במקביל עד אמצע דצמבר. חוק ההסדרים, הנלווה לתקציב מאז אמצע שנות השמונים, מעגן שורה של רפורמות משקיות וצעדי הכנסה וקיצוץ, ומאחר שהדיון בו נערך במקביל לדיון בתקציב, לחברי הכנסת אין די זמן להעמיק באף אחד מהם. בוועדות דורשים חברי הקואליציה "כספים קואליציוניים" למוסדות דת, תרבות והתיישבות, והאוצר נאלץ להיענות לחלק מהדרישות, דבר המחייב קיצוץ רוחבי נוסף. לחצים אלה מתחזקים בעבודת הלוביסטים, המבקשים לשנות רפורמות בחוק ההסדרים באופן שאינו בהכרח מיטיב עם "האזרח הקטן".</w:t>
-      </w:r>
-    </w:p>
-    <w:p>
-      <w:pPr>
-        <w:bidi/>
-        <w:spacing w:after="0" w:before="0" w:line="480" w:lineRule="auto"/>
+        <w:t xml:space="preserve">השלב השלישי: הנחה על שולחן הכנסת ודיון בוועדות. </w:t>
+      </w:r>
+      <w:r>
+        <w:rPr>
+          <w:rFonts w:ascii="David" w:cs="David" w:eastAsia="David" w:hAnsi="David"/>
+          <w:b w:val="false"/>
+          <w:i w:val="false"/>
+          <w:sz w:val="24"/>
+          <w:szCs w:val="24"/>
+          <w:rtl/>
+        </w:rPr>
+        <w:t xml:space="preserve">בשנה רגילה מונח התקציב עד 31 באוקטובר ומאושר בקריאה ראשונה בתחילת נובמבר. ועדת הכנסת מפצלת את חוק ההסדרים בין הוועדות השונות ומעבירה את חוק התקציב לוועדת הכספים, והוועדות דנות בשניהם במקביל עד אמצע דצמבר. חוק ההסדרים, הנלווה לתקציב מאז אמצע שנות השמונים, מעגן רפורמות משקיות וצעדי הכנסה וקיצוץ, ומאחר שהדיון בו נערך במקביל לדיון בתקציב, לחברי הכנסת אין די זמן להעמיק באף אחד מהם (זרחיה, 2026א). בוועדות דורשים חברי הקואליציה "כספים קואליציוניים" למוסדות דת, תרבות והתיישבות, והאוצר נאלץ להיענות לחלק מהדרישות, דבר המחייב קיצוץ רוחבי נוסף. לחצים אלה מתחזקים בעבודת הלוביסטים, שחוק השדלנים משנת 2008 אינו מחייב אותם להירשם בדיוני הוועדות ואינו חל כלל על משרדי הממשלה ופקידיהם (זרחיה, 2026ב).</w:t>
+      </w:r>
+    </w:p>
+    <w:p>
+      <w:pPr>
+        <w:bidi/>
+        <w:spacing w:after="0" w:before="0" w:line="360" w:lineRule="auto"/>
         <w:ind w:firstLine="567"/>
         <w:jc w:val="both"/>
       </w:pPr>
@@ -378,25 +397,25 @@
           <w:szCs w:val="24"/>
           <w:rtl/>
         </w:rPr>
-        <w:t xml:space="preserve">שלב רביעי - אישור סופי ומנגנון הלחץ. </w:t>
-      </w:r>
-      <w:r>
-        <w:rPr>
-          <w:rFonts w:ascii="David" w:cs="David" w:eastAsia="David" w:hAnsi="David"/>
-          <w:b w:val="false"/>
-          <w:i w:val="false"/>
-          <w:sz w:val="24"/>
-          <w:szCs w:val="24"/>
-          <w:rtl/>
-        </w:rPr>
-        <w:t xml:space="preserve">עד 31 בדצמבר נדרש אישור בקריאה שנייה ושלישית. אם התקציב אינו מאושר, המדינה מתנהלת בתקציב המשכי חודשי בגובה 1/12 מתקציב השנה הקודמת, ואם אינו מאושר עד 31 במרץ, או בתוך 100 ימים מהקמת ממשלה חדשה, הכנסת מתפזרת ונערכות בחירות. מנגנון זה הוא מקור הכוח העיקרי של הממשלה מול חברי הקואליציה: הם מאשרים את התקציב מפני שאינם רוצים לאבד את מקומם בכנסת. יש להוסיף כי מאז 2009 מאושרים בישראל לעיתים קרובות תקציבים דו-שנתיים. יתרונם באופק תכנון למשרדים וביציבות פוליטית, אך חסרונם המרכזי הוא הקטנת הפיקוח הפרלמנטרי, שכן הכנסת מוותרת על אחת משתי הזדמנויות הפיקוח השנתיות שלה.</w:t>
+        <w:t xml:space="preserve">השלב הרביעי: אישור סופי ומנגנון הלחץ. </w:t>
+      </w:r>
+      <w:r>
+        <w:rPr>
+          <w:rFonts w:ascii="David" w:cs="David" w:eastAsia="David" w:hAnsi="David"/>
+          <w:b w:val="false"/>
+          <w:i w:val="false"/>
+          <w:sz w:val="24"/>
+          <w:szCs w:val="24"/>
+          <w:rtl/>
+        </w:rPr>
+        <w:t xml:space="preserve">עד 31 בדצמבר נדרש אישור בקריאה שנייה ושלישית. אם התקציב אינו מאושר, המדינה מתנהלת בתקציב המשכי חודשי בגובה 1/12 מתקציב השנה הקודמת, ואם אינו מאושר עד 31 במרץ, או בתוך 100 ימים מהקמת ממשלה חדשה, הכנסת מתפזרת. מנגנון זה הוא מקור הכוח העיקרי של הממשלה מול חברי הקואליציה: הם מאשרים את התקציב מפני שאינם רוצים לאבד את מקומם בכנסת (זרחיה, 2026א). מאז 2009 מאושרים בישראל לעיתים קרובות תקציבים דו-שנתיים. יתרונם באופק תכנון למשרדים וביציבות פוליטית, אך הכנסת מוותרת בהם על אחת משתי הזדמנויות הפיקוח השנתיות שלה (זרחיה, 2026א).</w:t>
       </w:r>
     </w:p>
     <w:p>
       <w:pPr>
         <w:pStyle w:val="Heading1"/>
         <w:bidi/>
-        <w:spacing w:after="0" w:before="240" w:line="480" w:lineRule="auto"/>
+        <w:spacing w:after="120" w:before="240" w:line="360" w:lineRule="auto"/>
         <w:jc w:val="right"/>
       </w:pPr>
       <w:r>
@@ -415,7 +434,7 @@
     <w:p>
       <w:pPr>
         <w:bidi/>
-        <w:spacing w:after="0" w:before="0" w:line="480" w:lineRule="auto"/>
+        <w:spacing w:after="0" w:before="0" w:line="360" w:lineRule="auto"/>
         <w:ind w:firstLine="567"/>
         <w:jc w:val="both"/>
       </w:pPr>
@@ -428,13 +447,13 @@
           <w:szCs w:val="24"/>
           <w:rtl/>
         </w:rPr>
-        <w:t xml:space="preserve">תקציב 2024-2023 אושר במאי 2023 בהיקף של 484.8 מיליארד ש"ח ל-2023 ו-513.7 מיליארד ש"ח ל-2024. מלחמת חרבות ברזל שינתה את התמונה מיסודה. בצד ההוצאות זינקו הוצאות הביטחון: גיוס של כ-350 אלף אנשי מילואים עלה כ-3 מיליארד ש"ח לשבוע, ולכך נוספו רכש ציוד ואמצעי לחימה. נוספו גם הוצאות אזרחיות של המלחמה: לינת כ-125 אלף מפונים בבתי מלון, שיקום יישובי עוטף עזה והצפון, ופיצויים לעסקים ולתושבים באזורי הלחימה ובכל הארץ. בצד ההכנסות ירדה גביית המסים, משום שהמשק היה משותק בחודשים הראשונים. התוצאה היא גירעון גדל, שבתקופת חירום מותר ואף רצוי להרחיבו כמדיניות אנטי-מחזורית, כדי שהעסקים ימשיכו לפעול ולשלם מסים (זרחיה, 2026). בנק ישראל אמד את העלות הכוללת של המלחמה למשק בכ-250 מיליארד ש"ח לשנים 2025-2023 (בנק ישראל, 2025).</w:t>
-      </w:r>
-    </w:p>
-    <w:p>
-      <w:pPr>
-        <w:bidi/>
-        <w:spacing w:after="0" w:before="0" w:line="480" w:lineRule="auto"/>
+        <w:t xml:space="preserve">תקציב 2024-2023 אושר במאי 2023 בהיקף של 484.8 מיליארד ש"ח ל-2023 ו-513.7 מיליארד ש"ח ל-2024 (זרחיה, 2026א). מלחמת חרבות ברזל שינתה את התמונה מיסודה. בצד ההוצאות זינקו הוצאות הביטחון: גיוס של כ-350 אלף אנשי מילואים עלה כ-3 מיליארד ש"ח לשבוע, ולכך נוספו רכש ציוד ואמצעי לחימה. נוספו גם הוצאות אזרחיות של המלחמה, ובהן לינת כ-125 אלף מפונים בבתי מלון, שיקום יישובי עוטף עזה והצפון ופיצויים לעסקים ולתושבים. בצד ההכנסות ירדה גביית המסים, משום שהמשק היה משותק בחודשים הראשונים (זרחיה, 2026א). התוצאה היא גירעון גדל, שבתקופת חירום מותר ואף רצוי להרחיבו כמדיניות אנטי-מחזורית. בנק ישראל אמד את העלות הכוללת של המלחמה למשק בכ-250 מיליארד ש"ח לשנים 2025-2023 (בנק ישראל, 2025).</w:t>
+      </w:r>
+    </w:p>
+    <w:p>
+      <w:pPr>
+        <w:bidi/>
+        <w:spacing w:after="0" w:before="0" w:line="360" w:lineRule="auto"/>
         <w:ind w:firstLine="567"/>
         <w:jc w:val="both"/>
       </w:pPr>
@@ -447,13 +466,13 @@
           <w:szCs w:val="24"/>
           <w:rtl/>
         </w:rPr>
-        <w:t xml:space="preserve">כתוצאה מכך נפרץ התקציב שוב ושוב. בדצמבר 2023 אושר תקציב נוסף ל-2023, גבוה ב-25.9 מיליארד ש"ח מהמקורי, שהגיע ל-510.7 מיליארד ש"ח. בפברואר 2024 הניחה הממשלה הצעת תקציב מעודכן ל-2024 בסך 584.1 מיליארד ש"ח, גבוה ב-70.4 מיליארד ש"ח מהתקציב שאושר תשעה חודשים קודם לכן. במהלך 2024 אושר תקציב נוסף של 3.357 מיליארד ש"ח למימון המשך שהיית מפוני הצפון, ובדצמבר 2024 אושר תקציב נוסף בשל אי-הגעת הסיוע האמריקאי. תקציב 2024 נפרץ אפוא ארבע פעמים, וכל פריצה אושרה בכנסת בדיון קצר ובלחץ זמן.</w:t>
-      </w:r>
-    </w:p>
-    <w:p>
-      <w:pPr>
-        <w:bidi/>
-        <w:spacing w:after="0" w:before="0" w:line="480" w:lineRule="auto"/>
+        <w:t xml:space="preserve">התקציב נפרץ שוב ושוב. בדצמבר 2023 אושר תקציב נוסף ל-2023, גבוה ב-25.9 מיליארד ש"ח מהמקורי, שהגיע ל-510.7 מיליארד ש"ח. בפברואר 2024 הניחה הממשלה הצעת תקציב מעודכן ל-2024 בסך 584.1 מיליארד ש"ח, גבוה ב-70.4 מיליארד ש"ח מהתקציב שאושר תשעה חודשים קודם לכן (מרכז המחקר והמידע של הכנסת, 2024). במהלך 2024 אושר תקציב נוסף של 3.357 מיליארד ש"ח למימון המשך שהיית מפוני הצפון, ובדצמבר 2024 אושר תקציב נוסף בשל אי-הגעת הסיוע האמריקאי (זרחיה, 2026א). תקציב 2024 נפרץ אפוא ארבע פעמים. כל פריצה אושרה בכנסת בדיון קצר ובלחץ זמן.</w:t>
+      </w:r>
+    </w:p>
+    <w:p>
+      <w:pPr>
+        <w:bidi/>
+        <w:spacing w:after="0" w:before="0" w:line="360" w:lineRule="auto"/>
         <w:ind w:firstLine="567"/>
         <w:jc w:val="both"/>
       </w:pPr>
@@ -466,13 +485,13 @@
           <w:szCs w:val="24"/>
           <w:rtl/>
         </w:rPr>
-        <w:t xml:space="preserve">תקציב 2025 גובש על רקע פער מקורות של כ-40 מיליארד ש"ח, שנסגר בשילוב של גירעון גבוה וסל "גזירות": העלאת המע"מ ל-18%, הקפאת נקודות הזיכוי ומדרגות המס (הפסד של כ-120 ש"ח לשנה על כל נקודה), הקפאת עדכון קצבאות הביטוח הלאומי הפוגעת בנכים, בקשישים ובניצולי שואה, אי-עדכון מדרגות מס הרכישה והפטור על שכר דירה, מס על "רווחים כלואים", והרחבת מס הרווחים על הבנקים (2.5 מיליארד ש"ח על רווחי 2025-2024) גם לשנת 2026. ניסיונות למסות את קרנות ההשתלמות, להגדיל את הפרשות הפנסיה התקציבית ולבטל את הסכם השכר במגזר הציבורי נתקלו בהתנגדות ההסתדרות והוועדים (משרד האוצר, 2024). מהניתוח עולה הבחנה מטרידה: הצעדים שפוגעים בציבור הרחב באופן "שקט" ומפוזר, כמו הקפאת נקודות זיכוי, זכו לסיכוי אישור גבוה, ואילו צעדים שפוגעים בקבוצות מאורגנות, כמו ועדים, בנקים, ענף התיירות ובעלי הון, נחלשו או נדחו. זו תמונת ראי לכוחם של הלוביסטים וקבוצות האינטרס: הנטל זורם אל מי שאינו מאורגן.</w:t>
-      </w:r>
-    </w:p>
-    <w:p>
-      <w:pPr>
-        <w:bidi/>
-        <w:spacing w:after="0" w:before="0" w:line="480" w:lineRule="auto"/>
+        <w:t xml:space="preserve">תקציב 2025 גובש על רקע פער מקורות של כ-40 מיליארד ש"ח, שנסגר בשילוב של גירעון גבוה וסל "גזירות": העלאת המע"מ ל-18%, הקפאת נקודות הזיכוי ומדרגות המס (הפסד של כ-120 ש"ח לשנה על כל נקודה), הקפאת עדכון קצבאות הביטוח הלאומי הפוגעת בנכים, בקשישים ובניצולי שואה, אי-עדכון מדרגות מס הרכישה והפטור על שכר דירה, מס על "רווחים כלואים", והרחבת מס הרווחים על הבנקים (2.5 מיליארד ש"ח על רווחי 2025-2024) גם לשנת 2026 (משרד האוצר, 2024). ניסיונות למסות את קרנות ההשתלמות, להגדיל את הפרשות הפנסיה התקציבית ולבטל את הסכם השכר במגזר הציבורי נתקלו בהתנגדות ההסתדרות והוועדים (זרחיה, 2026א). מהניתוח עולה הבחנה מטרידה. הצעדים שפוגעים בציבור הרחב באופן "שקט" ומפוזר, כמו הקפאת נקודות זיכוי, זכו לסיכוי אישור גבוה, ואילו צעדים שפוגעים בקבוצות מאורגנות, כמו ועדים, בנקים, ענף התיירות ובעלי הון, נחלשו או נדחו. הנטל זורם אל מי שאינו מאורגן.</w:t>
+      </w:r>
+    </w:p>
+    <w:p>
+      <w:pPr>
+        <w:bidi/>
+        <w:spacing w:after="0" w:before="0" w:line="360" w:lineRule="auto"/>
         <w:ind w:firstLine="567"/>
         <w:jc w:val="both"/>
       </w:pPr>
@@ -485,13 +504,13 @@
           <w:szCs w:val="24"/>
           <w:rtl/>
         </w:rPr>
-        <w:t xml:space="preserve">במקביל התרחב תקציב הביטחון באופן שאין לו תקדים מאז שנות השבעים. תקציב הביטחון, שעמד ערב המלחמה על כ-60 מיליארד ש"ח, זינק ליותר מ-100 מיליארד ש"ח ב-2024. בינואר 2025 המליצה הוועדה לבחינת תקציב הביטחון ובניין הכוח (ועדת נגל) על תוספת רב-שנתית בהיקף מצטבר של יותר מ-100 מיליארד ש"ח עד סוף העשור, כך שהוצאות הביטחון יישארו גבוהות מהותית מרמתן לפני המלחמה גם לאחר סיום הלחימה (ועדת נגל, 2025). תקציב 2026, שגובש בסוף 2025 ערב שנת בחירות, ממשיך את המגמה: תקציב ביטחון ברמת שיא, יעד גירעון שמרני יותר, וויכוח ציבורי חריף על המשך הזרמת כספים קואליציוניים, שכבר בתחילת המלחמה דרש האוצר להקפיא מהם כ-9 מיליארד ש"ח שלא בוצעו לשנים 2024-2023.</w:t>
-      </w:r>
-    </w:p>
-    <w:p>
-      <w:pPr>
-        <w:bidi/>
-        <w:spacing w:after="0" w:before="0" w:line="480" w:lineRule="auto"/>
+        <w:t xml:space="preserve">במקביל התרחב תקציב הביטחון באופן שאין לו תקדים מאז שנות השבעים. תקציב הביטחון, שעמד ערב המלחמה על כ-60 מיליארד ש"ח, זינק ליותר מ-100 מיליארד ש"ח ב-2024 (בנק ישראל, 2025). בינואר 2025 המליצה הוועדה לבחינת תקציב הביטחון ובניין הכוח על תוספת רב-שנתית בהיקף מצטבר של יותר מ-100 מיליארד ש"ח עד סוף העשור, כך שהוצאות הביטחון יישארו גבוהות בהרבה מרמתן לפני המלחמה גם לאחר סיום הלחימה (הוועדה לבחינת תקציב הביטחון ובניין הכוח, 2025). תקציב 2026, שגובש בסוף 2025 ערב שנת בחירות, ממשיך את המגמה: תקציב ביטחון ברמת שיא, יעד גירעון שמרני יותר וויכוח ציבורי חריף על המשך הזרמת כספים קואליציוניים. כבר בתחילת המלחמה דרש האוצר להקפיא מהם כ-9 מיליארד ש"ח שלא בוצעו לשנים 2024-2023 (זרחיה, 2026א).</w:t>
+      </w:r>
+    </w:p>
+    <w:p>
+      <w:pPr>
+        <w:bidi/>
+        <w:spacing w:after="0" w:before="0" w:line="360" w:lineRule="auto"/>
         <w:ind w:firstLine="567"/>
         <w:jc w:val="both"/>
       </w:pPr>
@@ -516,14 +535,14 @@
           <w:szCs w:val="24"/>
           <w:rtl/>
         </w:rPr>
-        <w:t xml:space="preserve">הן ארבע. ראשית, נטל מס גבוה יותר ורגרסיבי: העלאת המע"מ והקפאת נקודות הזיכוי פוגעות במידה רבה יותר בשכבות הביניים והחלשות, ששיעור הצריכה מהכנסתן גבוה. שנית, דחיקה של ההוצאה האזרחית: כל שקל שמוסט לביטחון בלי מקור חדש מגיע מקיצוץ רוחבי בחינוך, בבריאות, ברווחה ובתשתיות, ואלה בדיוק התחומים שמעצבים את הצמיחה העתידית ואת יוקר המחיה. שלישית, ריבית ומשכנתאות: שלוש חברות הדירוג הורידו את דירוג האשראי של ישראל או את תחזיתו במהלך 2024-2023, ופיץ' הורידה באוגוסט 2024 את הדירוג מ-A+ ל-A עם תחזית שלילית. הורדות אלה ייקרו את גיוס החוב, והנגיד שמר על ריבית גבוהה גם לנוכח הגירעון, כך שהריבית על משכנתאות, שרובן נלקחו בריבית פריים, נותרה גבוהה. רביעית, נטל בין-דורי: יחס החוב לתוצר עלה מכ-60% ערב המלחמה לכ-69% בסוף 2024 (בנק ישראל, 2025), ומי שישלם את הריבית על החוב הזה הם הצעירים, אותם משרתי מילואים שכבר נשאו בנטל הישיר של המלחמה.</w:t>
+        <w:t xml:space="preserve">הן ארבע. ראשית, נטל מס גבוה יותר ורגרסיבי: העלאת המע"מ והקפאת נקודות הזיכוי פוגעות במידה רבה יותר בשכבות הביניים והחלשות, ששיעור הצריכה מהכנסתן גבוה (המכון הישראלי לדמוקרטיה, 2024). שנית, דחיקה של ההוצאה האזרחית: כל שקל שמוסט לביטחון בלי מקור חדש מגיע מקיצוץ רוחבי בחינוך, בבריאות, ברווחה ובתשתיות, ואלה בדיוק התחומים שמעצבים את הצמיחה העתידית ואת יוקר המחיה. שלישית, ריבית ומשכנתאות: שלוש חברות הדירוג הורידו את דירוג האשראי של ישראל או את תחזיתו במהלך 2024-2023, ופיץ' הורידה באוגוסט 2024 את הדירוג מ-A+ ל-A עם תחזית שלילית (זרחיה, 2026א). הורדות אלה ייקרו את גיוס החוב, והנגיד שמר על ריבית גבוהה גם לנוכח הגירעון, כך שהריבית על משכנתאות, שרובן נלקחו בריבית פריים, נותרה גבוהה. רביעית, נטל בין-דורי: יחס החוב לתוצר עלה מכ-60% ערב המלחמה לכ-69% בסוף 2024 (בנק ישראל, 2025). את הריבית על החוב הזה ישלמו הצעירים, אותם משרתי מילואים שכבר נשאו בנטל הישיר של המלחמה.</w:t>
       </w:r>
     </w:p>
     <w:p>
       <w:pPr>
         <w:pStyle w:val="Heading1"/>
         <w:bidi/>
-        <w:spacing w:after="0" w:before="240" w:line="480" w:lineRule="auto"/>
+        <w:spacing w:after="120" w:before="240" w:line="360" w:lineRule="auto"/>
         <w:jc w:val="right"/>
       </w:pPr>
       <w:r>
@@ -542,7 +561,7 @@
     <w:p>
       <w:pPr>
         <w:bidi/>
-        <w:spacing w:after="0" w:before="0" w:line="480" w:lineRule="auto"/>
+        <w:spacing w:after="0" w:before="0" w:line="360" w:lineRule="auto"/>
         <w:ind w:firstLine="567"/>
         <w:jc w:val="both"/>
       </w:pPr>
@@ -555,13 +574,13 @@
           <w:szCs w:val="24"/>
           <w:rtl/>
         </w:rPr>
-        <w:t xml:space="preserve">הניתוח לעיל מצביע על שתי חולשות מבניות: הכנסת מקבלת את התקציב מאוחר מדי ובלי כלים מקצועיים משלה, ובמהלך השנה היא מאשרת שינויים של עשרות מיליארדים כמעט ללא דיון. אציע שישה שינויים.</w:t>
-      </w:r>
-    </w:p>
-    <w:p>
-      <w:pPr>
-        <w:bidi/>
-        <w:spacing w:after="0" w:before="0" w:line="480" w:lineRule="auto"/>
+        <w:t xml:space="preserve">הניתוח בפרקים הקודמים מצביע על שתי חולשות מבניות: הכנסת מקבלת את התקציב מאוחר מדי ובלי כלים מקצועיים משלה, ובמהלך השנה היא מאשרת שינויים של עשרות מיליארדים כמעט ללא דיון. מוצעים שישה שינויים.</w:t>
+      </w:r>
+    </w:p>
+    <w:p>
+      <w:pPr>
+        <w:bidi/>
+        <w:spacing w:after="0" w:before="0" w:line="360" w:lineRule="auto"/>
         <w:jc w:val="both"/>
       </w:pPr>
       <w:r>
@@ -585,7 +604,7 @@
           <w:szCs w:val="24"/>
           <w:rtl/>
         </w:rPr>
-        <w:t xml:space="preserve">הנחת התקציב עד 15 בספטמבר במקום 31 באוקטובר, וקביעה בחוק של תקופת דיון מינימלית של 90 יום בוועדות. </w:t>
+        <w:t xml:space="preserve">הנחת התקציב עד 15 בספטמבר במקום 31 באוקטובר, וקביעה בחוק של תקופת דיון של 90 יום לפחות בוועדות. </w:t>
       </w:r>
       <w:r>
         <w:rPr>
@@ -608,7 +627,7 @@
           <w:szCs w:val="24"/>
           <w:rtl/>
         </w:rPr>
-        <w:t xml:space="preserve">הגבלת חוק ההסדרים לסעיפים בעלי השלכה תקציבית ישירה בלבד, והעברת רפורמות מבניות למסלול חקיקה רגיל עם דיון מלא בוועדה המקצועית, כפי שהמליצו בעבר מבקר המדינה והמכון הישראלי לדמוקרטיה. </w:t>
+        <w:t xml:space="preserve">הגבלת חוק ההסדרים לסעיפים בעלי השלכה תקציבית ישירה בלבד, והעברת רפורמות מבניות למסלול חקיקה רגיל עם דיון מלא בוועדה המקצועית, כפי שהמליץ המכון הישראלי לדמוקרטיה (2024). </w:t>
       </w:r>
       <w:r>
         <w:rPr>
@@ -631,13 +650,13 @@
           <w:szCs w:val="24"/>
           <w:rtl/>
         </w:rPr>
-        <w:t xml:space="preserve">הרחבת מרכז המחקר והמידע של הכנסת ליחידה מקצועית, בדומה ל-CBO בארצות הברית, שתפרסם אומדני עלות עצמאיים לתחזיות האוצר, להצעות חוק ולהסכמים קואליציוניים, ותשבור את מונופול המידע של אגף התקציבים.</w:t>
-      </w:r>
-    </w:p>
-    <w:p>
-      <w:pPr>
-        <w:bidi/>
-        <w:spacing w:after="0" w:before="0" w:line="480" w:lineRule="auto"/>
+        <w:t xml:space="preserve">הרחבת מרכז המחקר והמידע של הכנסת ליחידה מקצועית, בדומה למשרד התקציב של הקונגרס בארצות הברית, שתפרסם אומדני עלות עצמאיים לתחזיות האוצר, להצעות חוק ולהסכמים קואליציוניים. יחידה כזו תשבור את מונופול המידע של אגף התקציבים, שהניתוח בפרק א' הראה שהוא מקור הריכוזיות (זרחיה, 2026א).</w:t>
+      </w:r>
+    </w:p>
+    <w:p>
+      <w:pPr>
+        <w:bidi/>
+        <w:spacing w:after="0" w:before="0" w:line="360" w:lineRule="auto"/>
         <w:jc w:val="both"/>
       </w:pPr>
       <w:r>
@@ -673,48 +692,48 @@
           <w:szCs w:val="24"/>
           <w:rtl/>
         </w:rPr>
-        <w:t xml:space="preserve">5. פיקוח על תקציב הביטחון. </w:t>
-      </w:r>
-      <w:r>
-        <w:rPr>
-          <w:rFonts w:ascii="David" w:cs="David" w:eastAsia="David" w:hAnsi="David"/>
-          <w:b w:val="false"/>
-          <w:i w:val="false"/>
-          <w:sz w:val="24"/>
-          <w:szCs w:val="24"/>
-          <w:rtl/>
-        </w:rPr>
-        <w:t xml:space="preserve">הרחבת סמכויות ועדת המשנה המשותפת לתקציב הביטחון, חובת דיון פומבי בהמלצות ועדת נגל, ופרסום גרסה לא מסווגת של תקציב הביטחון ברמת פירוט דומה לזו של משרדים אזרחיים. </w:t>
-      </w:r>
-      <w:r>
-        <w:rPr>
-          <w:rFonts w:ascii="David" w:cs="David" w:eastAsia="David" w:hAnsi="David"/>
-          <w:b/>
-          <w:bCs/>
-          <w:i w:val="false"/>
-          <w:sz w:val="24"/>
-          <w:szCs w:val="24"/>
-          <w:rtl/>
-        </w:rPr>
-        <w:t xml:space="preserve">6. כללים למצבי חירום. </w:t>
-      </w:r>
-      <w:r>
-        <w:rPr>
-          <w:rFonts w:ascii="David" w:cs="David" w:eastAsia="David" w:hAnsi="David"/>
-          <w:b w:val="false"/>
-          <w:i w:val="false"/>
-          <w:sz w:val="24"/>
-          <w:szCs w:val="24"/>
-          <w:rtl/>
-        </w:rPr>
-        <w:t xml:space="preserve">"הקופסה החוץ-תקציבית" צריכה להיות מוגבלת בזמן ובסכום, לעבור אישור מפורש של הכנסת ולהתפרסם, כדי שהחירום לא יהפוך למסלול עוקף פיקוח. בנוסף, ראוי לחזור לתקציב שנתי, או לפחות לחייב דיון מעמיק בכנסת במחצית התקופה של תקציב דו-שנתי.</w:t>
+        <w:t xml:space="preserve">5. רישום לוביסטים בוועדות. </w:t>
+      </w:r>
+      <w:r>
+        <w:rPr>
+          <w:rFonts w:ascii="David" w:cs="David" w:eastAsia="David" w:hAnsi="David"/>
+          <w:b w:val="false"/>
+          <w:i w:val="false"/>
+          <w:sz w:val="24"/>
+          <w:szCs w:val="24"/>
+          <w:rtl/>
+        </w:rPr>
+        <w:t xml:space="preserve">השלמת הפרצה בחוק השדלנים כך שכל מי שפועל להשפיע על סעיף בתקציב או בחוק ההסדרים, בכנסת או מול משרדי הממשלה, יירשם ויזוהה בדיון (זרחיה, 2026ב). </w:t>
+      </w:r>
+      <w:r>
+        <w:rPr>
+          <w:rFonts w:ascii="David" w:cs="David" w:eastAsia="David" w:hAnsi="David"/>
+          <w:b/>
+          <w:bCs/>
+          <w:i w:val="false"/>
+          <w:sz w:val="24"/>
+          <w:szCs w:val="24"/>
+          <w:rtl/>
+        </w:rPr>
+        <w:t xml:space="preserve">6. פיקוח על תקציב הביטחון וכללים למצבי חירום. </w:t>
+      </w:r>
+      <w:r>
+        <w:rPr>
+          <w:rFonts w:ascii="David" w:cs="David" w:eastAsia="David" w:hAnsi="David"/>
+          <w:b w:val="false"/>
+          <w:i w:val="false"/>
+          <w:sz w:val="24"/>
+          <w:szCs w:val="24"/>
+          <w:rtl/>
+        </w:rPr>
+        <w:t xml:space="preserve">הרחבת סמכויות ועדת המשנה המשותפת לתקציב הביטחון, חובת דיון פומבי בהמלצות ועדת נגל ופרסום גרסה לא מסווגת של תקציב הביטחון. "הקופסה החוץ-תקציבית" שנהוגה בזמן מלחמה (זרחיה, 2026א) צריכה להיות מוגבלת בזמן ובסכום ולעבור אישור מפורש של הכנסת, כדי שהחירום לא יהפוך למסלול עוקף פיקוח.</w:t>
       </w:r>
     </w:p>
     <w:p>
       <w:pPr>
         <w:pStyle w:val="Heading1"/>
         <w:bidi/>
-        <w:spacing w:after="0" w:before="240" w:line="480" w:lineRule="auto"/>
+        <w:spacing w:after="120" w:before="240" w:line="360" w:lineRule="auto"/>
         <w:jc w:val="right"/>
       </w:pPr>
       <w:r>
@@ -733,7 +752,7 @@
     <w:p>
       <w:pPr>
         <w:bidi/>
-        <w:spacing w:after="0" w:before="0" w:line="480" w:lineRule="auto"/>
+        <w:spacing w:after="0" w:before="0" w:line="360" w:lineRule="auto"/>
         <w:ind w:firstLine="567"/>
         <w:jc w:val="both"/>
       </w:pPr>
@@ -746,13 +765,13 @@
           <w:szCs w:val="24"/>
           <w:rtl/>
         </w:rPr>
-        <w:t xml:space="preserve">בהערכה מפוכחת, הסיכוי לשינוי מבני עמוק בטווח הקצר נמוך. כל השחקנים המרכזיים נהנים מהמצב הקיים: הממשלה נהנית מהריכוזיות ומהמנגנון המאיים בפיזור הכנסת, חברי הקואליציה נהנים מהכספים הקואליציוניים, ומשרד האוצר נהנה ממונופול על המידע. מי שמפסיד, הציבור הרחב ובעיקר הצעירים, אינו מאורגן ואינו נוכח בוועדת הכספים. ההיסטוריה מלמדת ששינויים בהליך התקציב התרחשו בישראל רק בעקבות משברים: חוק ההסדרים נולד במשבר 1985, והתקציב הדו-שנתי נולד מהבחירות של 2009.</w:t>
-      </w:r>
-    </w:p>
-    <w:p>
-      <w:pPr>
-        <w:bidi/>
-        <w:spacing w:after="0" w:before="0" w:line="480" w:lineRule="auto"/>
+        <w:t xml:space="preserve">העבודה יצאה משאלה אחת: כיצד מאושר תקציב המדינה, ומי משלם כאשר הוא נפרץ. התשובה שעלתה מהפרקים הקודמים היא שהתהליך ריכוזי בידי האוצר, שהכנסת מאשרת אותו בלחץ זמן ובאיום פיזור, ושבמלחמה נפרץ התקציב ארבע פעמים בשנה אחת בעוד הנטל מוסט למי שאינו מאורגן. הסיכוי לשינוי מבני עמוק בטווח הקצר נמוך. כל הגורמים המעורבים נהנים מהמצב הקיים: הממשלה מהריכוזיות וממנגנון הפיזור, חברי הקואליציה מהכספים הקואליציוניים, ומשרד האוצר ממונופול על המידע. מי שמפסיד, הציבור הרחב ובעיקר הצעירים, אינו נוכח בוועדת הכספים. שינויים בהליך התקציב התרחשו בישראל רק בעקבות משברים: חוק ההסדרים נולד בתוכנית הייצוב של 1985, והתקציב הדו-שנתי נולד מהבחירות של 2009 (זרחיה, 2026א).</w:t>
+      </w:r>
+    </w:p>
+    <w:p>
+      <w:pPr>
+        <w:bidi/>
+        <w:spacing w:after="0" w:before="0" w:line="360" w:lineRule="auto"/>
         <w:ind w:firstLine="567"/>
         <w:jc w:val="both"/>
       </w:pPr>
@@ -765,13 +784,13 @@
           <w:szCs w:val="24"/>
           <w:rtl/>
         </w:rPr>
-        <w:t xml:space="preserve">עם זאת, המלחמה יצרה חלון הזדמנויות נדיר. הציבור משלם את החשבון בצורה מוחשית: במע"מ, בהקפאת הקצבאות, בריבית על המשכנתא ובימי מילואים. אזרחים שמשרתים מאות ימי מילואים דורשים "שוויון בנטל" גם בתקציב, וחברות הדירוג מפעילות לחץ חיצוני לאחריות פיסקלית. בשנת בחירות, שקיפות תקציבית עשויה להפוך לנכס פוליטי. לדעתי, הרפורמות בעלות הסיכוי הגבוה ביותר הן אלה שאינן מחייבות את הממשלה לוותר על כוח, אלא רק על סודיות: פרסום מוקדם של העברות תקציביות, סעיף נפרד לכספים קואליציוניים והקמת יחידת אומדנים עצמאית בכנסת. ארגוני חברה אזרחית כמו התנועה לאיכות השלטון, לובי 99 והמכון הישראלי לדמוקרטיה יכולים לקדם אותן גם מול ממשלה עוינת, משום שהן קשות להתנגדות פומבית.</w:t>
-      </w:r>
-    </w:p>
-    <w:p>
-      <w:pPr>
-        <w:bidi/>
-        <w:spacing w:after="0" w:before="0" w:line="480" w:lineRule="auto"/>
+        <w:t xml:space="preserve">המלחמה יצרה בכל זאת חלון הזדמנויות. הציבור משלם את החשבון בצורה מוחשית, במע"מ, בהקפאת הקצבאות, בריבית על המשכנתא ובימי מילואים, וחברות הדירוג מפעילות לחץ חיצוני לאחריות פיסקלית (בנק ישראל, 2025). בשנת בחירות, שקיפות תקציבית עשויה להפוך לנכס פוליטי. הרפורמות בעלות הסיכוי הגבוה ביותר הן אלה שאינן מחייבות את הממשלה לוותר על כוח, אלא על סודיות בלבד: פרסום מוקדם של העברות תקציביות, סעיף נפרד לכספים קואליציוניים והקמת יחידת אומדנים עצמאית בכנסת. ארגוני חברה אזרחית יכולים לקדם אותן גם מול ממשלה עוינת, משום שקשה להתנגד להן בפומבי.</w:t>
+      </w:r>
+    </w:p>
+    <w:p>
+      <w:pPr>
+        <w:bidi/>
+        <w:spacing w:after="0" w:before="0" w:line="360" w:lineRule="auto"/>
         <w:ind w:firstLine="567"/>
         <w:jc w:val="both"/>
       </w:pPr>
@@ -784,14 +803,19 @@
           <w:szCs w:val="24"/>
           <w:rtl/>
         </w:rPr>
-        <w:t xml:space="preserve">עמדתי האישית היא שהשאלה האמיתית אינה האם תקציב הביטחון צריך לגדול, שכן אחרי 7 באוקטובר ברור שכן, אלא מי מחליט על חשבון מה הוא גדל. כל עוד ההחלטה מתקבלת בין פקידי האוצר לשרים ב"בזאר טורקי", ומאושרת בכנסת בלילה אחד של דצמבר, הנטל ימשיך לזרום למי שאינו מאורגן. פיקוח פרלמנטרי אמיתי לא ימנע את הגזירות, אבל הוא יחייב את מקבלי ההחלטות להסביר אותן בפומבי, וזהו התנאי הראשון לחלוקת נטל הוגנת יותר.</w:t>
+        <w:t xml:space="preserve">עמדתי האישית היא שהשאלה האמיתית אינה האם תקציב הביטחון צריך לגדול. אחרי 7 באוקטובר ברור שכן. השאלה היא מי מחליט על חשבון מה הוא גדל. כל עוד ההחלטה מתקבלת בין פקידי האוצר לשרים ב"בזאר טורקי" ומאושרת בכנסת בלילה אחד של דצמבר, הנטל ימשיך לזרום למי שאינו מאורגן. פיקוח פרלמנטרי אמיתי לא ימנע את הגזירות, אבל הוא יחייב את מקבלי ההחלטות להסביר אותן בפומבי. זהו התנאי הראשון לחלוקת נטל הוגנת יותר, וזו גם ההמלצה המעשית של עבודה זו: להתחיל מהשקיפות, כי היא זולה, מיידית, וקשה להתנגד לה.</w:t>
+      </w:r>
+    </w:p>
+    <w:p>
+      <w:r>
+        <w:br w:type="page"/>
       </w:r>
     </w:p>
     <w:p>
       <w:pPr>
         <w:pStyle w:val="Heading1"/>
         <w:bidi/>
-        <w:spacing w:after="0" w:before="240" w:line="480" w:lineRule="auto"/>
+        <w:spacing w:after="120" w:before="240" w:line="360" w:lineRule="auto"/>
         <w:jc w:val="right"/>
       </w:pPr>
       <w:r>
@@ -811,7 +835,7 @@
       <w:pPr>
         <w:bidi/>
         <w:spacing w:after="120" w:line="360" w:lineRule="auto"/>
-        <w:ind w:left="567" w:hanging="567"/>
+        <w:ind w:left="709" w:hanging="709"/>
         <w:jc w:val="right"/>
       </w:pPr>
       <w:r>
@@ -823,14 +847,37 @@
           <w:szCs w:val="24"/>
           <w:rtl/>
         </w:rPr>
-        <w:t xml:space="preserve">בנק ישראל (2025). דוח בנק ישראל לשנת 2024: פרק ב' - המדיניות הפיסקלית, ההוצאה על המלחמה והחוב הציבורי. ירושלים: בנק ישראל, חטיבת המחקר, מרץ 2025.</w:t>
+        <w:t xml:space="preserve">בנק ישראל. (2025). </w:t>
+      </w:r>
+      <w:r>
+        <w:rPr>
+          <w:rFonts w:ascii="David" w:cs="David" w:eastAsia="David" w:hAnsi="David"/>
+          <w:b w:val="false"/>
+          <w:i/>
+          <w:iCs/>
+          <w:sz w:val="24"/>
+          <w:szCs w:val="24"/>
+          <w:rtl/>
+        </w:rPr>
+        <w:t xml:space="preserve">דוח בנק ישראל 2024</w:t>
+      </w:r>
+      <w:r>
+        <w:rPr>
+          <w:rFonts w:ascii="David" w:cs="David" w:eastAsia="David" w:hAnsi="David"/>
+          <w:b w:val="false"/>
+          <w:i w:val="false"/>
+          <w:sz w:val="24"/>
+          <w:szCs w:val="24"/>
+          <w:rtl/>
+        </w:rPr>
+        <w:t xml:space="preserve"> [דוח שנתי]. https://www.boi.org.il</w:t>
       </w:r>
     </w:p>
     <w:p>
       <w:pPr>
         <w:bidi/>
         <w:spacing w:after="120" w:line="360" w:lineRule="auto"/>
-        <w:ind w:left="567" w:hanging="567"/>
+        <w:ind w:left="709" w:hanging="709"/>
         <w:jc w:val="right"/>
       </w:pPr>
       <w:r>
@@ -842,14 +889,37 @@
           <w:szCs w:val="24"/>
           <w:rtl/>
         </w:rPr>
-        <w:t xml:space="preserve">הוועדה לבחינת תקציב הביטחון ובניין הכוח ("ועדת נגל") (2025). דוח הוועדה: המלצות לתקציב הביטחון ולבניין הכוח לשנים 2035-2025. ירושלים: משרד ראש הממשלה ומשרד האוצר, ינואר 2025.</w:t>
+        <w:t xml:space="preserve">הוועדה לבחינת תקציב הביטחון ובניין הכוח. (2025). </w:t>
+      </w:r>
+      <w:r>
+        <w:rPr>
+          <w:rFonts w:ascii="David" w:cs="David" w:eastAsia="David" w:hAnsi="David"/>
+          <w:b w:val="false"/>
+          <w:i/>
+          <w:iCs/>
+          <w:sz w:val="24"/>
+          <w:szCs w:val="24"/>
+          <w:rtl/>
+        </w:rPr>
+        <w:t xml:space="preserve">דוח הוועדה לבחינת תקציב הביטחון ובניין הכוח</w:t>
+      </w:r>
+      <w:r>
+        <w:rPr>
+          <w:rFonts w:ascii="David" w:cs="David" w:eastAsia="David" w:hAnsi="David"/>
+          <w:b w:val="false"/>
+          <w:i w:val="false"/>
+          <w:sz w:val="24"/>
+          <w:szCs w:val="24"/>
+          <w:rtl/>
+        </w:rPr>
+        <w:t xml:space="preserve"> [דוח ועדה]. משרד ראש הממשלה. https://www.gov.il</w:t>
       </w:r>
     </w:p>
     <w:p>
       <w:pPr>
         <w:bidi/>
         <w:spacing w:after="120" w:line="360" w:lineRule="auto"/>
-        <w:ind w:left="567" w:hanging="567"/>
+        <w:ind w:left="709" w:hanging="709"/>
         <w:jc w:val="right"/>
       </w:pPr>
       <w:r>
@@ -861,14 +931,37 @@
           <w:szCs w:val="24"/>
           <w:rtl/>
         </w:rPr>
-        <w:t xml:space="preserve">זרחיה, צ' (2026). סוגיות בכלכלה וחברה: דרך גיבוש ואישור תקציב המדינה והשינויים בעקבות חרבות ברזל (מצגות ההרצאות בקורס). רחובות: המרכז האקדמי פרס, שנת הלימודים תשפ"ו.</w:t>
+        <w:t xml:space="preserve">המכון הישראלי לדמוקרטיה. (2024). </w:t>
+      </w:r>
+      <w:r>
+        <w:rPr>
+          <w:rFonts w:ascii="David" w:cs="David" w:eastAsia="David" w:hAnsi="David"/>
+          <w:b w:val="false"/>
+          <w:i/>
+          <w:iCs/>
+          <w:sz w:val="24"/>
+          <w:szCs w:val="24"/>
+          <w:rtl/>
+        </w:rPr>
+        <w:t xml:space="preserve">כנס אלי הורביץ לכלכלה וחברה 2024: המשק הישראלי בצל המלחמה</w:t>
+      </w:r>
+      <w:r>
+        <w:rPr>
+          <w:rFonts w:ascii="David" w:cs="David" w:eastAsia="David" w:hAnsi="David"/>
+          <w:b w:val="false"/>
+          <w:i w:val="false"/>
+          <w:sz w:val="24"/>
+          <w:szCs w:val="24"/>
+          <w:rtl/>
+        </w:rPr>
+        <w:t xml:space="preserve"> [ניירות מדיניות]. https://www.idi.org.il</w:t>
       </w:r>
     </w:p>
     <w:p>
       <w:pPr>
         <w:bidi/>
         <w:spacing w:after="120" w:line="360" w:lineRule="auto"/>
-        <w:ind w:left="567" w:hanging="567"/>
+        <w:ind w:left="709" w:hanging="709"/>
         <w:jc w:val="right"/>
       </w:pPr>
       <w:r>
@@ -880,14 +973,37 @@
           <w:szCs w:val="24"/>
           <w:rtl/>
         </w:rPr>
-        <w:t xml:space="preserve">המכון הישראלי לדמוקרטיה (2024). כנס אלי הורביץ לכלכלה וחברה 2024: המשק הישראלי בצל המלחמה - ניירות מדיניות. ירושלים: המכון הישראלי לדמוקרטיה, דצמבר 2024.</w:t>
+        <w:t xml:space="preserve">זרחיה, צ' (2026א). </w:t>
+      </w:r>
+      <w:r>
+        <w:rPr>
+          <w:rFonts w:ascii="David" w:cs="David" w:eastAsia="David" w:hAnsi="David"/>
+          <w:b w:val="false"/>
+          <w:i/>
+          <w:iCs/>
+          <w:sz w:val="24"/>
+          <w:szCs w:val="24"/>
+          <w:rtl/>
+        </w:rPr>
+        <w:t xml:space="preserve">דרך גיבוש ואישור תקציב המדינה והשינויים בעקבות חרבות ברזל</w:t>
+      </w:r>
+      <w:r>
+        <w:rPr>
+          <w:rFonts w:ascii="David" w:cs="David" w:eastAsia="David" w:hAnsi="David"/>
+          <w:b w:val="false"/>
+          <w:i w:val="false"/>
+          <w:sz w:val="24"/>
+          <w:szCs w:val="24"/>
+          <w:rtl/>
+        </w:rPr>
+        <w:t xml:space="preserve"> [מצגת הרצאה]. סוגיות בכלכלה וחברה, המרכז האקדמי פרס.</w:t>
       </w:r>
     </w:p>
     <w:p>
       <w:pPr>
         <w:bidi/>
         <w:spacing w:after="120" w:line="360" w:lineRule="auto"/>
-        <w:ind w:left="567" w:hanging="567"/>
+        <w:ind w:left="709" w:hanging="709"/>
         <w:jc w:val="right"/>
       </w:pPr>
       <w:r>
@@ -899,14 +1015,37 @@
           <w:szCs w:val="24"/>
           <w:rtl/>
         </w:rPr>
-        <w:t xml:space="preserve">מרכז המחקר והמידע של הכנסת (2024). הצעת תקציב המדינה לשנת 2024: תיאור וניתוח לקראת הדיון בוועדת הכספים. ירושלים: הכנסת, פברואר 2024.</w:t>
+        <w:t xml:space="preserve">זרחיה, צ' (2026ב). </w:t>
+      </w:r>
+      <w:r>
+        <w:rPr>
+          <w:rFonts w:ascii="David" w:cs="David" w:eastAsia="David" w:hAnsi="David"/>
+          <w:b w:val="false"/>
+          <w:i/>
+          <w:iCs/>
+          <w:sz w:val="24"/>
+          <w:szCs w:val="24"/>
+          <w:rtl/>
+        </w:rPr>
+        <w:t xml:space="preserve">התגברות תופעת הלובינג והמאכרים וההשלכות על התחרות</w:t>
+      </w:r>
+      <w:r>
+        <w:rPr>
+          <w:rFonts w:ascii="David" w:cs="David" w:eastAsia="David" w:hAnsi="David"/>
+          <w:b w:val="false"/>
+          <w:i w:val="false"/>
+          <w:sz w:val="24"/>
+          <w:szCs w:val="24"/>
+          <w:rtl/>
+        </w:rPr>
+        <w:t xml:space="preserve"> [מצגת הרצאה]. סוגיות בכלכלה וחברה, המרכז האקדמי פרס.</w:t>
       </w:r>
     </w:p>
     <w:p>
       <w:pPr>
         <w:bidi/>
         <w:spacing w:after="120" w:line="360" w:lineRule="auto"/>
-        <w:ind w:left="567" w:hanging="567"/>
+        <w:ind w:left="709" w:hanging="709"/>
         <w:jc w:val="right"/>
       </w:pPr>
       <w:r>
@@ -918,7 +1057,72 @@
           <w:szCs w:val="24"/>
           <w:rtl/>
         </w:rPr>
-        <w:t xml:space="preserve">משרד האוצר, אגף התקציבים (2024). הצעת תקציב המדינה לשנת הכספים 2025: עיקרי התקציב וחוק ההסדרים. ירושלים: משרד האוצר, נובמבר 2024.</w:t>
+        <w:t xml:space="preserve">מרכז המחקר והמידע של הכנסת. (2024). </w:t>
+      </w:r>
+      <w:r>
+        <w:rPr>
+          <w:rFonts w:ascii="David" w:cs="David" w:eastAsia="David" w:hAnsi="David"/>
+          <w:b w:val="false"/>
+          <w:i/>
+          <w:iCs/>
+          <w:sz w:val="24"/>
+          <w:szCs w:val="24"/>
+          <w:rtl/>
+        </w:rPr>
+        <w:t xml:space="preserve">הצעת תקציב המדינה לשנת 2024: תיאור וניתוח</w:t>
+      </w:r>
+      <w:r>
+        <w:rPr>
+          <w:rFonts w:ascii="David" w:cs="David" w:eastAsia="David" w:hAnsi="David"/>
+          <w:b w:val="false"/>
+          <w:i w:val="false"/>
+          <w:sz w:val="24"/>
+          <w:szCs w:val="24"/>
+          <w:rtl/>
+        </w:rPr>
+        <w:t xml:space="preserve"> [מסמך רקע לוועדת הכספים]. הכנסת. https://main.knesset.gov.il</w:t>
+      </w:r>
+    </w:p>
+    <w:p>
+      <w:pPr>
+        <w:bidi/>
+        <w:spacing w:after="120" w:line="360" w:lineRule="auto"/>
+        <w:ind w:left="709" w:hanging="709"/>
+        <w:jc w:val="right"/>
+      </w:pPr>
+      <w:r>
+        <w:rPr>
+          <w:rFonts w:ascii="David" w:cs="David" w:eastAsia="David" w:hAnsi="David"/>
+          <w:b w:val="false"/>
+          <w:i w:val="false"/>
+          <w:sz w:val="24"/>
+          <w:szCs w:val="24"/>
+          <w:rtl/>
+        </w:rPr>
+        <w:t xml:space="preserve">משרד האוצר, אגף התקציבים. (2024). </w:t>
+      </w:r>
+      <w:r>
+        <w:rPr>
+          <w:rFonts w:ascii="David" w:cs="David" w:eastAsia="David" w:hAnsi="David"/>
+          <w:b w:val="false"/>
+          <w:i/>
+          <w:iCs/>
+          <w:sz w:val="24"/>
+          <w:szCs w:val="24"/>
+          <w:rtl/>
+        </w:rPr>
+        <w:t xml:space="preserve">הצעת תקציב המדינה לשנת הכספים 2025: עיקרי התקציב</w:t>
+      </w:r>
+      <w:r>
+        <w:rPr>
+          <w:rFonts w:ascii="David" w:cs="David" w:eastAsia="David" w:hAnsi="David"/>
+          <w:b w:val="false"/>
+          <w:i w:val="false"/>
+          <w:sz w:val="24"/>
+          <w:szCs w:val="24"/>
+          <w:rtl/>
+        </w:rPr>
+        <w:t xml:space="preserve"> [הצעת תקציב]. https://www.gov.il/he/departments/ministry_of_finance</w:t>
       </w:r>
     </w:p>
     <w:sectPr>
@@ -1339,7 +1543,7 @@
     <w:next w:val="Normal"/>
     <w:qFormat/>
     <w:pPr>
-      <w:spacing w:after="0" w:before="240"/>
+      <w:spacing w:after="120" w:before="240"/>
     </w:pPr>
     <w:rPr>
       <w:rFonts w:ascii="David" w:cs="David" w:eastAsia="David" w:hAnsi="David"/>

</xml_diff>

<commit_message>
Add source links to the paper's reference list
Replace generic site addresses with direct links to the Bank of Israel
2024 annual report, the IDI Eli Hurvitz 2024 macro session, the Knesset
research center's 2024 deficit paper, the Finance Ministry's 2025 budget
highlights, and the press report on the Nagel committee recommendations.

Co-Authored-By: Claude Fable 5.1 <noreply@anthropic.com>
Claude-Session: https://claude.ai/code/session_01PyNnM7vakGaTMmd6pZkA5P
</commit_message>
<xml_diff>
--- a/papers/final-paper-state-budget.docx
+++ b/papers/final-paper-state-budget.docx
@@ -245,7 +245,7 @@
           <w:szCs w:val="24"/>
           <w:rtl/>
         </w:rPr>
-        <w:t xml:space="preserve">העבודה עוסקת בארבע שאלות. הפרק הראשון מתאר את שלבי גיבוש התקציב ואישורו בממשלה ובכנסת. הפרק השני מנתח את השינויים שחלו בתקציבי 2026-2023 בעקבות מלחמת "חרבות ברזל" ואת השלכות הגדלת תקציב הביטחון על הציבור. הפרק השלישי מציע שינויים בפיקוח הפרלמנטרי, והפרק הרביעי מעריך את הסיכוי לשינוי ומציג עמדה אישית. הניתוח נשען על חומרי הקורס, על פרסומי בנק ישראל ומשרד האוצר, על ניתוחי מרכז המחקר והמידע של הכנסת ועל דוח ועדת נגל לתקציב הביטחון.</w:t>
+        <w:t xml:space="preserve">העבודה עוסקת בארבע שאלות. הפרק הראשון מתאר את שלבי גיבוש התקציב ואישורו בממשלה ובכנסת. הפרק השני מנתח את השינויים שחלו בתקציבי 2026-2023 בעקבות מלחמת "חרבות ברזל" ואת השלכות הגדלת תקציב הביטחון על הציבור. הפרק השלישי מציע שינויים בפיקוח הפרלמנטרי, והפרק הרביעי מעריך את הסיכוי לשינוי ומציג עמדה אישית. הניתוח נשען על חומרי הקורס, על פרסומי בנק ישראל ומשרד האוצר, על ניתוחי מרכז המחקר והמידע של הכנסת ועל הדיווח העיתונאי על המלצות ועדת נגל לתקציב הביטחון.</w:t>
       </w:r>
     </w:p>
     <w:p>
@@ -504,7 +504,7 @@
           <w:szCs w:val="24"/>
           <w:rtl/>
         </w:rPr>
-        <w:t xml:space="preserve">במקביל התרחב תקציב הביטחון באופן שאין לו תקדים מאז שנות השבעים. תקציב הביטחון, שעמד ערב המלחמה על כ-60 מיליארד ש"ח, זינק ליותר מ-100 מיליארד ש"ח ב-2024 (בנק ישראל, 2025). בינואר 2025 המליצה הוועדה לבחינת תקציב הביטחון ובניין הכוח על תוספת רב-שנתית בהיקף מצטבר של יותר מ-100 מיליארד ש"ח עד סוף העשור, כך שהוצאות הביטחון יישארו גבוהות בהרבה מרמתן לפני המלחמה גם לאחר סיום הלחימה (הוועדה לבחינת תקציב הביטחון ובניין הכוח, 2025). תקציב 2026, שגובש בסוף 2025 ערב שנת בחירות, ממשיך את המגמה: תקציב ביטחון ברמת שיא, יעד גירעון שמרני יותר וויכוח ציבורי חריף על המשך הזרמת כספים קואליציוניים. כבר בתחילת המלחמה דרש האוצר להקפיא מהם כ-9 מיליארד ש"ח שלא בוצעו לשנים 2024-2023 (זרחיה, 2026א).</w:t>
+        <w:t xml:space="preserve">במקביל התרחב תקציב הביטחון באופן שאין לו תקדים מאז שנות השבעים. תקציב הביטחון, שעמד ערב המלחמה על כ-60 מיליארד ש"ח, זינק ליותר מ-100 מיליארד ש"ח ב-2024 (בנק ישראל, 2025). בינואר 2025 המליצה הוועדה לבחינת תקציב הביטחון ובניין הכוח (ועדת נגל) על תוספת של 9 עד 15 מיליארד ש"ח בשנה לתקציב הביטחון, ובסך הכול כ-133 מיליארד ש"ח בעשור הקרוב, כך שהוצאות הביטחון יישארו גבוהות בהרבה מרמתן לפני המלחמה גם לאחר סיום הלחימה (המלצות ועדת נגל, 2025). תקציב 2026, שגובש בסוף 2025 ערב שנת בחירות, ממשיך את המגמה: תקציב ביטחון ברמת שיא, יעד גירעון שמרני יותר וויכוח ציבורי חריף על המשך הזרמת כספים קואליציוניים. כבר בתחילת המלחמה דרש האוצר להקפיא מהם כ-9 מיליארד ש"ח שלא בוצעו לשנים 2024-2023 (זרחיה, 2026א).</w:t>
       </w:r>
     </w:p>
     <w:p>
@@ -535,7 +535,7 @@
           <w:szCs w:val="24"/>
           <w:rtl/>
         </w:rPr>
-        <w:t xml:space="preserve">הן ארבע. ראשית, נטל מס גבוה יותר ורגרסיבי: העלאת המע"מ והקפאת נקודות הזיכוי פוגעות במידה רבה יותר בשכבות הביניים והחלשות, ששיעור הצריכה מהכנסתן גבוה (המכון הישראלי לדמוקרטיה, 2024). שנית, דחיקה של ההוצאה האזרחית: כל שקל שמוסט לביטחון בלי מקור חדש מגיע מקיצוץ רוחבי בחינוך, בבריאות, ברווחה ובתשתיות, ואלה בדיוק התחומים שמעצבים את הצמיחה העתידית ואת יוקר המחיה. שלישית, ריבית ומשכנתאות: שלוש חברות הדירוג הורידו את דירוג האשראי של ישראל או את תחזיתו במהלך 2024-2023, ופיץ' הורידה באוגוסט 2024 את הדירוג מ-A+ ל-A עם תחזית שלילית (זרחיה, 2026א). הורדות אלה ייקרו את גיוס החוב, והנגיד שמר על ריבית גבוהה גם לנוכח הגירעון, כך שהריבית על משכנתאות, שרובן נלקחו בריבית פריים, נותרה גבוהה. רביעית, נטל בין-דורי: יחס החוב לתוצר עלה מכ-60% ערב המלחמה לכ-69% בסוף 2024 (בנק ישראל, 2025). את הריבית על החוב הזה ישלמו הצעירים, אותם משרתי מילואים שכבר נשאו בנטל הישיר של המלחמה.</w:t>
+        <w:t xml:space="preserve">הן ארבע. ראשית, נטל מס גבוה יותר ורגרסיבי: העלאת המע"מ והקפאת נקודות הזיכוי פוגעות במידה רבה יותר בשכבות הביניים והחלשות, ששיעור הצריכה מהכנסתן גבוה (המכון הישראלי לדמוקרטיה, 2024). שנית, דחיקה של ההוצאה האזרחית: כל שקל שמוסט לביטחון בלי מקור חדש מגיע מקיצוץ רוחבי בחינוך, בבריאות, ברווחה ובתשתיות, ואלה בדיוק התחומים שמעצבים את הצמיחה העתידית ואת יוקר המחיה. שלישית, ריבית ומשכנתאות: שלוש חברות הדירוג הורידו את דירוג האשראי של ישראל או את תחזיתו במהלך 2024-2023, ופיץ' הורידה באוגוסט 2024 את הדירוג מ-A+ ל-A עם תחזית שלילית (זרחיה, 2026א). הורדות אלה ייקרו את גיוס החוב, והנגיד שמר על ריבית גבוהה גם לנוכח הגירעון, כך שהריבית על משכנתאות, שרובן נלקחו בריבית פריים, נותרה גבוהה. רביעית, נטל בין-דורי: יחס החוב לתוצר עלה מכ-60% ערב המלחמה לכ-69% בסוף 2024, והעלייה בגירעון מגדילה את תשלומי הריבית של הממשלה לשנים קדימה (בנק ישראל, 2025; מרכז המחקר והמידע של הכנסת, 2024). את הריבית על החוב הזה ישלמו הצעירים, אותם משרתי מילואים שכבר נשאו בנטל הישיר של המלחמה.</w:t>
       </w:r>
     </w:p>
     <w:p>
@@ -870,7 +870,7 @@
           <w:szCs w:val="24"/>
           <w:rtl/>
         </w:rPr>
-        <w:t xml:space="preserve"> [דוח שנתי]. https://www.boi.org.il</w:t>
+        <w:t xml:space="preserve"> [דוח שנתי]. https://www.boi.org.il/publications/regularpublications/boi-reports/%D7%93%D7%95%D7%97-%D7%91%D7%A0%D7%A7-%D7%99%D7%A9%D7%A8%D7%90%D7%9C-2024/</w:t>
       </w:r>
     </w:p>
     <w:p>
@@ -889,7 +889,7 @@
           <w:szCs w:val="24"/>
           <w:rtl/>
         </w:rPr>
-        <w:t xml:space="preserve">הוועדה לבחינת תקציב הביטחון ובניין הכוח. (2025). </w:t>
+        <w:t xml:space="preserve">המכון הישראלי לדמוקרטיה. (2024, מאי). </w:t>
       </w:r>
       <w:r>
         <w:rPr>
@@ -901,18 +901,18 @@
           <w:szCs w:val="24"/>
           <w:rtl/>
         </w:rPr>
-        <w:t xml:space="preserve">דוח הוועדה לבחינת תקציב הביטחון ובניין הכוח</w:t>
-      </w:r>
-      <w:r>
-        <w:rPr>
-          <w:rFonts w:ascii="David" w:cs="David" w:eastAsia="David" w:hAnsi="David"/>
-          <w:b w:val="false"/>
-          <w:i w:val="false"/>
-          <w:sz w:val="24"/>
-          <w:szCs w:val="24"/>
-          <w:rtl/>
-        </w:rPr>
-        <w:t xml:space="preserve"> [דוח ועדה]. משרד ראש הממשלה. https://www.gov.il</w:t>
+        <w:t xml:space="preserve">כלכלת ישראל בצל המלחמה והאסטרטגיה התקציבית לשנים הבאות</w:t>
+      </w:r>
+      <w:r>
+        <w:rPr>
+          <w:rFonts w:ascii="David" w:cs="David" w:eastAsia="David" w:hAnsi="David"/>
+          <w:b w:val="false"/>
+          <w:i w:val="false"/>
+          <w:sz w:val="24"/>
+          <w:szCs w:val="24"/>
+          <w:rtl/>
+        </w:rPr>
+        <w:t xml:space="preserve"> [מצגת, מושב המאקרו, כנס אלי הורביץ לכלכלה וחברה 2024]. https://www.idi.org.il/galleries/54634</w:t>
       </w:r>
     </w:p>
     <w:p>
@@ -931,7 +931,7 @@
           <w:szCs w:val="24"/>
           <w:rtl/>
         </w:rPr>
-        <w:t xml:space="preserve">המכון הישראלי לדמוקרטיה. (2024). </w:t>
+        <w:t xml:space="preserve">המלצות ועדת נגל: תוספת של עד 15 מיליארד שקל בשנה לתקציב הביטחון, גיוס חרדים וערבים. (2025, 6 בינואר). </w:t>
       </w:r>
       <w:r>
         <w:rPr>
@@ -943,18 +943,18 @@
           <w:szCs w:val="24"/>
           <w:rtl/>
         </w:rPr>
-        <w:t xml:space="preserve">כנס אלי הורביץ לכלכלה וחברה 2024: המשק הישראלי בצל המלחמה</w:t>
-      </w:r>
-      <w:r>
-        <w:rPr>
-          <w:rFonts w:ascii="David" w:cs="David" w:eastAsia="David" w:hAnsi="David"/>
-          <w:b w:val="false"/>
-          <w:i w:val="false"/>
-          <w:sz w:val="24"/>
-          <w:szCs w:val="24"/>
-          <w:rtl/>
-        </w:rPr>
-        <w:t xml:space="preserve"> [ניירות מדיניות]. https://www.idi.org.il</w:t>
+        <w:t xml:space="preserve">ynet</w:t>
+      </w:r>
+      <w:r>
+        <w:rPr>
+          <w:rFonts w:ascii="David" w:cs="David" w:eastAsia="David" w:hAnsi="David"/>
+          <w:b w:val="false"/>
+          <w:i w:val="false"/>
+          <w:sz w:val="24"/>
+          <w:szCs w:val="24"/>
+          <w:rtl/>
+        </w:rPr>
+        <w:t xml:space="preserve">. https://www.ynet.co.il/economy/article/bkbi3ttuye</w:t>
       </w:r>
     </w:p>
     <w:p>
@@ -1069,18 +1069,18 @@
           <w:szCs w:val="24"/>
           <w:rtl/>
         </w:rPr>
-        <w:t xml:space="preserve">הצעת תקציב המדינה לשנת 2024: תיאור וניתוח</w:t>
-      </w:r>
-      <w:r>
-        <w:rPr>
-          <w:rFonts w:ascii="David" w:cs="David" w:eastAsia="David" w:hAnsi="David"/>
-          <w:b w:val="false"/>
-          <w:i w:val="false"/>
-          <w:sz w:val="24"/>
-          <w:szCs w:val="24"/>
-          <w:rtl/>
-        </w:rPr>
-        <w:t xml:space="preserve"> [מסמך רקע לוועדת הכספים]. הכנסת. https://main.knesset.gov.il</w:t>
+        <w:t xml:space="preserve">התפתחות הגירעון התקציבי בשנת 2024 ובשנים הבאות</w:t>
+      </w:r>
+      <w:r>
+        <w:rPr>
+          <w:rFonts w:ascii="David" w:cs="David" w:eastAsia="David" w:hAnsi="David"/>
+          <w:b w:val="false"/>
+          <w:i w:val="false"/>
+          <w:sz w:val="24"/>
+          <w:szCs w:val="24"/>
+          <w:rtl/>
+        </w:rPr>
+        <w:t xml:space="preserve"> [מסמך רקע]. הכנסת. https://fs.knesset.gov.il/globaldocs/MMM/4eff0a9c-13f7-ee11-8162-005056aa4246/2_4eff0a9c-13f7-ee11-8162-005056aa4246_11_20592.pdf</w:t>
       </w:r>
     </w:p>
     <w:p>
@@ -1099,7 +1099,7 @@
           <w:szCs w:val="24"/>
           <w:rtl/>
         </w:rPr>
-        <w:t xml:space="preserve">משרד האוצר, אגף התקציבים. (2024). </w:t>
+        <w:t xml:space="preserve">משרד האוצר, אגף התקציבים. (2024, דצמבר). </w:t>
       </w:r>
       <w:r>
         <w:rPr>
@@ -1111,18 +1111,18 @@
           <w:szCs w:val="24"/>
           <w:rtl/>
         </w:rPr>
-        <w:t xml:space="preserve">הצעת תקציב המדינה לשנת הכספים 2025: עיקרי התקציב</w:t>
-      </w:r>
-      <w:r>
-        <w:rPr>
-          <w:rFonts w:ascii="David" w:cs="David" w:eastAsia="David" w:hAnsi="David"/>
-          <w:b w:val="false"/>
-          <w:i w:val="false"/>
-          <w:sz w:val="24"/>
-          <w:szCs w:val="24"/>
-          <w:rtl/>
-        </w:rPr>
-        <w:t xml:space="preserve"> [הצעת תקציב]. https://www.gov.il/he/departments/ministry_of_finance</w:t>
+        <w:t xml:space="preserve">הצעה לשנת תקציב המדינה 2025: עיקרי התקציב</w:t>
+      </w:r>
+      <w:r>
+        <w:rPr>
+          <w:rFonts w:ascii="David" w:cs="David" w:eastAsia="David" w:hAnsi="David"/>
+          <w:b w:val="false"/>
+          <w:i w:val="false"/>
+          <w:sz w:val="24"/>
+          <w:szCs w:val="24"/>
+          <w:rtl/>
+        </w:rPr>
+        <w:t xml:space="preserve"> [הצעת תקציב]. https://www.gov.il/blobFolder/policy/state-budget-main-2025/he/state-budget_2025_state-budget-main-2025-file.pdf</w:t>
       </w:r>
     </w:p>
     <w:sectPr>

</xml_diff>

<commit_message>
Ground part B of the paper in the Bank of Israel 2024 annual report
Use the report's own figures with page-level citations: the three 2024
budget re-openings (about 106 billion NIS), the 6.8% deficit, the debt
ratio rise from 61.5% to 67.8%, the rating downgrades and their stated
reasons, the Nagel committee's unfunded recommendations, the structural
deficit gap, and the VAT and interest-rate effects on households. Drop the
Knesset research center entry that is no longer cited.

Co-Authored-By: Claude Fable 5.1 <noreply@anthropic.com>
Claude-Session: https://claude.ai/code/session_01PyNnM7vakGaTMmd6pZkA5P
</commit_message>
<xml_diff>
--- a/papers/final-paper-state-budget.docx
+++ b/papers/final-paper-state-budget.docx
@@ -245,7 +245,7 @@
           <w:szCs w:val="24"/>
           <w:rtl/>
         </w:rPr>
-        <w:t xml:space="preserve">העבודה עוסקת בארבע שאלות. הפרק הראשון מתאר את שלבי גיבוש התקציב ואישורו בממשלה ובכנסת. הפרק השני מנתח את השינויים שחלו בתקציבי 2026-2023 בעקבות מלחמת "חרבות ברזל" ואת השלכות הגדלת תקציב הביטחון על הציבור. הפרק השלישי מציע שינויים בפיקוח הפרלמנטרי, והפרק הרביעי מעריך את הסיכוי לשינוי ומציג עמדה אישית. הניתוח נשען על חומרי הקורס, על פרסומי בנק ישראל ומשרד האוצר, על ניתוחי מרכז המחקר והמידע של הכנסת ועל הדיווח העיתונאי על המלצות ועדת נגל לתקציב הביטחון.</w:t>
+        <w:t xml:space="preserve">העבודה עוסקת בארבע שאלות. הפרק הראשון מתאר את שלבי גיבוש התקציב ואישורו בממשלה ובכנסת. הפרק השני מנתח את השינויים שחלו בתקציבי 2026-2023 בעקבות מלחמת "חרבות ברזל" ואת השלכות הגדלת תקציב הביטחון על הציבור. הפרק השלישי מציע שינויים בפיקוח הפרלמנטרי, והפרק הרביעי מעריך את הסיכוי לשינוי ומציג עמדה אישית. הניתוח נשען על חומרי הקורס, על דוח בנק ישראל לשנת 2024, על פרסומי משרד האוצר, על ניתוחי מרכז המחקר והמידע של הכנסת ועל הדיווח העיתונאי על המלצות ועדת נגל לתקציב הביטחון.</w:t>
       </w:r>
     </w:p>
     <w:p>
@@ -447,7 +447,7 @@
           <w:szCs w:val="24"/>
           <w:rtl/>
         </w:rPr>
-        <w:t xml:space="preserve">תקציב 2024-2023 אושר במאי 2023 בהיקף של 484.8 מיליארד ש"ח ל-2023 ו-513.7 מיליארד ש"ח ל-2024 (זרחיה, 2026א). מלחמת חרבות ברזל שינתה את התמונה מיסודה. בצד ההוצאות זינקו הוצאות הביטחון: גיוס של כ-350 אלף אנשי מילואים עלה כ-3 מיליארד ש"ח לשבוע, ולכך נוספו רכש ציוד ואמצעי לחימה. נוספו גם הוצאות אזרחיות של המלחמה, ובהן לינת כ-125 אלף מפונים בבתי מלון, שיקום יישובי עוטף עזה והצפון ופיצויים לעסקים ולתושבים. בצד ההכנסות ירדה גביית המסים, משום שהמשק היה משותק בחודשים הראשונים (זרחיה, 2026א). התוצאה היא גירעון גדל, שבתקופת חירום מותר ואף רצוי להרחיבו כמדיניות אנטי-מחזורית. בנק ישראל אמד את העלות הכוללת של המלחמה למשק בכ-250 מיליארד ש"ח לשנים 2025-2023 (בנק ישראל, 2025).</w:t>
+        <w:t xml:space="preserve">תקציב 2024-2023 אושר במאי 2023 בהיקף של 484.8 מיליארד ש"ח ל-2023 ו-513.7 מיליארד ש"ח ל-2024 (זרחיה, 2026א). מלחמת חרבות ברזל שינתה את התמונה מיסודה. בצד ההוצאות זינקו הוצאות הביטחון: גיוס של כ-350 אלף אנשי מילואים עלה כ-3 מיליארד ש"ח לשבוע, ולכך נוספו רכש ציוד ואמצעי לחימה. נוספו גם הוצאות אזרחיות של המלחמה, ובהן לינת כ-125 אלף מפונים בבתי מלון, שיקום יישובי עוטף עזה והצפון ופיצויים לעסקים ולתושבים. בצד ההכנסות ירדה גביית המסים, משום שהמשק היה משותק בחודשים הראשונים (זרחיה, 2026א). הממשלה בחרה לממן את הוצאות המלחמה בעיקר בהגדלת הגירעון, והמרווח הפיסקלי לכך התאפשר משום שערב המלחמה יחס החוב לתוצר היה נמוך ובמגמת ירידה (בנק ישראל, 2025, עמ' 17).</w:t>
       </w:r>
     </w:p>
     <w:p>
@@ -466,7 +466,7 @@
           <w:szCs w:val="24"/>
           <w:rtl/>
         </w:rPr>
-        <w:t xml:space="preserve">התקציב נפרץ שוב ושוב. בדצמבר 2023 אושר תקציב נוסף ל-2023, גבוה ב-25.9 מיליארד ש"ח מהמקורי, שהגיע ל-510.7 מיליארד ש"ח. בפברואר 2024 הניחה הממשלה הצעת תקציב מעודכן ל-2024 בסך 584.1 מיליארד ש"ח, גבוה ב-70.4 מיליארד ש"ח מהתקציב שאושר תשעה חודשים קודם לכן (מרכז המחקר והמידע של הכנסת, 2024). במהלך 2024 אושר תקציב נוסף של 3.357 מיליארד ש"ח למימון המשך שהיית מפוני הצפון, ובדצמבר 2024 אושר תקציב נוסף בשל אי-הגעת הסיוע האמריקאי (זרחיה, 2026א). תקציב 2024 נפרץ אפוא ארבע פעמים. כל פריצה אושרה בכנסת בדיון קצר ובלחץ זמן.</w:t>
+        <w:t xml:space="preserve">התקציב נפתח שוב ושוב. בדצמבר 2023 אושרה תוספת של כ-26 מיליארד ש"ח למסגרת 2023, ובמהלך 2024 נפתח התקציב שלוש פעמים בהיקף מצטבר של כ-106 מיליארד ש"ח, כ-5 אחוזי תוצר. העדכון הראשון, במרץ 2024, כלל אמנם קיצוץ של 9 מיליארד ש"ח כנגד תוספות אזרחיות שאינן קשורות למלחמה, אך התוספת נטו בגין המלחמה הגיעה ל-70 מיליארד ש"ח. העדכון השני, בספטמבר, מימן תשלומים למפונים בכ-3 מיליארד ש"ח, והשלישי נדרש בסוף השנה משום שההנחה שמענק הסיוע האמריקאי יתקבל במלואו ב-2024 לא התממשה (בנק ישראל, 2025, עמ' 128). התוצאה: גירעון של 6.8 אחוזי תוצר, ויחס חוב לתוצר שזינק מ-61.5 אחוזים בסוף 2023 ל-67.8 אחוזים בסוף 2024 (בנק ישראל, 2025, עמ' 127). בנק ישראל מוסיף ביקורת מוסדית: העדכונים התכופים וההימנעות מקיצוץ סעיפים לא דחופים הגדילו את חוסר הוודאות באשר ליכולת הממשלה לבצע התאמות, וסוכנויות הדירוג ציינו במפורש את ההתנהלות התקציבית והקואליציונית כאחד הגורמים להורדת הדירוג (בנק ישראל, 2025, עמ' 17, 128).</w:t>
       </w:r>
     </w:p>
     <w:p>
@@ -485,7 +485,7 @@
           <w:szCs w:val="24"/>
           <w:rtl/>
         </w:rPr>
-        <w:t xml:space="preserve">תקציב 2025 גובש על רקע פער מקורות של כ-40 מיליארד ש"ח, שנסגר בשילוב של גירעון גבוה וסל "גזירות": העלאת המע"מ ל-18%, הקפאת נקודות הזיכוי ומדרגות המס (הפסד של כ-120 ש"ח לשנה על כל נקודה), הקפאת עדכון קצבאות הביטוח הלאומי הפוגעת בנכים, בקשישים ובניצולי שואה, אי-עדכון מדרגות מס הרכישה והפטור על שכר דירה, מס על "רווחים כלואים", והרחבת מס הרווחים על הבנקים (2.5 מיליארד ש"ח על רווחי 2025-2024) גם לשנת 2026 (משרד האוצר, 2024). ניסיונות למסות את קרנות ההשתלמות, להגדיל את הפרשות הפנסיה התקציבית ולבטל את הסכם השכר במגזר הציבורי נתקלו בהתנגדות ההסתדרות והוועדים (זרחיה, 2026א). מהניתוח עולה הבחנה מטרידה. הצעדים שפוגעים בציבור הרחב באופן "שקט" ומפוזר, כמו הקפאת נקודות זיכוי, זכו לסיכוי אישור גבוה, ואילו צעדים שפוגעים בקבוצות מאורגנות, כמו ועדים, בנקים, ענף התיירות ובעלי הון, נחלשו או נדחו. הנטל זורם אל מי שאינו מאורגן.</w:t>
+        <w:t xml:space="preserve">תקציב 2025 גובש על רקע פער מקורות של כ-40 מיליארד ש"ח, שנסגר בשילוב של גירעון גבוה וסל "גזירות": העלאת המע"מ מ-17 ל-18 אחוזים, הקפאת נקודות הזיכוי ומדרגות המס, הקפאת עדכון קצבאות הביטוח הלאומי הפוגעת בנכים, בקשישים ובניצולי שואה, אי-עדכון מדרגות מס הרכישה, מס על "רווחים כלואים" והרחבת מס הרווחים על הבנקים (משרד האוצר, 2024). ניסיונות למסות את קרנות ההשתלמות, להגדיל את הפרשות הפנסיה התקציבית ולבטל את הסכם השכר במגזר הציבורי נתקלו בהתנגדות ההסתדרות והוועדים (זרחיה, 2026א). בנק ישראל מעריך שצעדי ההתכנסות, רובם בצד ההכנסות, מקזזים בקירוב את תוספת ההוצאות הקבועות של המלחמה, אך הגירעון המבני, כ-3.6 אחוזי תוצר, עדיין גבוה מהרמה הנדרשת להפחתת החוב, כ-3 אחוזים, משום שהממשלה הגדילה במקביל גם הוצאות קבועות אחרות ולא התמקדה בקיצוץ סעיפים הפוגעים בתמריצים לתעסוקה (בנק ישראל, 2025, עמ' 17, 127). מכאן הבחנה מטרידה: הצעדים שפוגעים בציבור הרחב באופן "שקט" ומפוזר, כמו הקפאת נקודות זיכוי, אושרו, ואילו צעדים שפוגעים בקבוצות מאורגנות, כמו ועדים, בנקים ובעלי הון, נחלשו או נדחו. הנטל זורם אל מי שאינו מאורגן.</w:t>
       </w:r>
     </w:p>
     <w:p>
@@ -504,7 +504,7 @@
           <w:szCs w:val="24"/>
           <w:rtl/>
         </w:rPr>
-        <w:t xml:space="preserve">במקביל התרחב תקציב הביטחון באופן שאין לו תקדים מאז שנות השבעים. תקציב הביטחון, שעמד ערב המלחמה על כ-60 מיליארד ש"ח, זינק ליותר מ-100 מיליארד ש"ח ב-2024 (בנק ישראל, 2025). בינואר 2025 המליצה הוועדה לבחינת תקציב הביטחון ובניין הכוח (ועדת נגל) על תוספת של 9 עד 15 מיליארד ש"ח בשנה לתקציב הביטחון, ובסך הכול כ-133 מיליארד ש"ח בעשור הקרוב, כך שהוצאות הביטחון יישארו גבוהות בהרבה מרמתן לפני המלחמה גם לאחר סיום הלחימה (המלצות ועדת נגל, 2025). תקציב 2026, שגובש בסוף 2025 ערב שנת בחירות, ממשיך את המגמה: תקציב ביטחון ברמת שיא, יעד גירעון שמרני יותר וויכוח ציבורי חריף על המשך הזרמת כספים קואליציוניים. כבר בתחילת המלחמה דרש האוצר להקפיא מהם כ-9 מיליארד ש"ח שלא בוצעו לשנים 2024-2023 (זרחיה, 2026א).</w:t>
+        <w:t xml:space="preserve">במקביל התרחב תקציב הביטחון באופן שאין לו תקדים מאז שנות השבעים. בינואר 2025 המליצה הוועדה לבחינת תקציב הביטחון ובניין הכוח (ועדת נגל) על תוספת של 9 עד 15 מיליארד ש"ח בשנה לתקציב הביטחון, ובסך הכול כ-133 מיליארד ש"ח בעשור הקרוב (המלצות ועדת נגל, 2025). בנק ישראל מציין שהוועדה המליצה גם שיחס החוב לתוצר יתייצב ב-2026 ויתחיל לרדת, אך לא התייחסה כלל למקורות המימון של ההוצאות הנוספות, כך שיידרשו התאמות נוספות בתקציב בשנים הקרובות (בנק ישראל, 2025, עמ' 17). חשוב מכך: העלייה בהוצאות הביטחון ובתשלומי הריבית הפכה את מגמת הירידה הארוכה שלהן, שאפשרה בשני העשורים האחרונים גידול בהוצאה האזרחית ללא העלאת מסים וללא עליית החוב (בנק ישראל, 2025, עמ' 127). תקציב 2026, שגובש בסוף 2025 ערב שנת בחירות, ממשיך את המגמה, וכבר בתחילת המלחמה דרש האוצר להקפיא כ-9 מיליארד ש"ח מכספים קואליציוניים שלא בוצעו לשנים 2024-2023 (זרחיה, 2026א).</w:t>
       </w:r>
     </w:p>
     <w:p>
@@ -535,7 +535,7 @@
           <w:szCs w:val="24"/>
           <w:rtl/>
         </w:rPr>
-        <w:t xml:space="preserve">הן ארבע. ראשית, נטל מס גבוה יותר ורגרסיבי: העלאת המע"מ והקפאת נקודות הזיכוי פוגעות במידה רבה יותר בשכבות הביניים והחלשות, ששיעור הצריכה מהכנסתן גבוה (המכון הישראלי לדמוקרטיה, 2024). שנית, דחיקה של ההוצאה האזרחית: כל שקל שמוסט לביטחון בלי מקור חדש מגיע מקיצוץ רוחבי בחינוך, בבריאות, ברווחה ובתשתיות, ואלה בדיוק התחומים שמעצבים את הצמיחה העתידית ואת יוקר המחיה. שלישית, ריבית ומשכנתאות: שלוש חברות הדירוג הורידו את דירוג האשראי של ישראל או את תחזיתו במהלך 2024-2023, ופיץ' הורידה באוגוסט 2024 את הדירוג מ-A+ ל-A עם תחזית שלילית (זרחיה, 2026א). הורדות אלה ייקרו את גיוס החוב, והנגיד שמר על ריבית גבוהה גם לנוכח הגירעון, כך שהריבית על משכנתאות, שרובן נלקחו בריבית פריים, נותרה גבוהה. רביעית, נטל בין-דורי: יחס החוב לתוצר עלה מכ-60% ערב המלחמה לכ-69% בסוף 2024, והעלייה בגירעון מגדילה את תשלומי הריבית של הממשלה לשנים קדימה (בנק ישראל, 2025; מרכז המחקר והמידע של הכנסת, 2024). את הריבית על החוב הזה ישלמו הצעירים, אותם משרתי מילואים שכבר נשאו בנטל הישיר של המלחמה.</w:t>
+        <w:t xml:space="preserve">הן ארבע. ראשית, נטל מס גבוה יותר ורגרסיבי: העלאת המע"מ תרמה לבדה כ-0.4 עד 0.5 נקודות אחוז לאינפלציה בתחילת 2025, והקפאת הצמדת מדרגות המס, שינויי מיסוי הרכב והעלאת תעריפי התחבורה הציבורית הוסיפו כ-0.2 נקודות אחוז (בנק ישראל, 2025, עמ' 60). מסים עקיפים פוגעים במידה רבה יותר בשכבות שרוב הכנסתן מופנית לצריכה (המכון הישראלי לדמוקרטיה, 2024). שנית, דחיקה של ההוצאה האזרחית: הבנק מזהיר מפני קיצוץ דווקא ברכיבי ההוצאה שהם מחוללי הצמיחה, חינוך, תחבורה ותשתיות, שבהם ההשקעה בישראל נמוכה בהשוואה בין-לאומית (בנק ישראל, 2025, עמ' 18). שלישית, ריבית: בנק ישראל הוריד את הריבית ל-4.5 אחוזים בינואר 2024 והותיר אותה ברמה זו כל השנה, בין היתר בשל ההרחבה הפיסקלית; העלייה בגירעון תרמה כחצי נקודת אחוז לציפיות האינפלציה, וכל נקודת אחוז ביחס החוב לתוצר מעלה את התשואות הארוכות בכ-0.1 נקודת אחוז (בנק ישראל, 2025, עמ' 18, 69, 74). מי שנטל משכנתה בריבית פריים חש זאת ישירות (זרחיה, 2026א). רביעית, נטל בין-דורי: את הריבית על חוב שגדל בכשש נקודות תוצר בשנה אחת ישלמו הצעירים, ונגיד הבנק מזהיר כי עליית נטל השירות הצבאי, ובייחוד המילואים, תמשיך לגבות מחיר כלכלי ניכר (בנק ישראל, 2025).</w:t>
       </w:r>
     </w:p>
     <w:p>
@@ -784,7 +784,7 @@
           <w:szCs w:val="24"/>
           <w:rtl/>
         </w:rPr>
-        <w:t xml:space="preserve">המלחמה יצרה בכל זאת חלון הזדמנויות. הציבור משלם את החשבון בצורה מוחשית, במע"מ, בהקפאת הקצבאות, בריבית על המשכנתא ובימי מילואים, וחברות הדירוג מפעילות לחץ חיצוני לאחריות פיסקלית (בנק ישראל, 2025). בשנת בחירות, שקיפות תקציבית עשויה להפוך לנכס פוליטי. הרפורמות בעלות הסיכוי הגבוה ביותר הן אלה שאינן מחייבות את הממשלה לוותר על כוח, אלא על סודיות בלבד: פרסום מוקדם של העברות תקציביות, סעיף נפרד לכספים קואליציוניים והקמת יחידת אומדנים עצמאית בכנסת. ארגוני חברה אזרחית יכולים לקדם אותן גם מול ממשלה עוינת, משום שקשה להתנגד להן בפומבי.</w:t>
+        <w:t xml:space="preserve">המלחמה יצרה בכל זאת חלון הזדמנויות. הציבור משלם את החשבון בצורה מוחשית, במע"מ, בהקפאת הקצבאות, בריבית על המשכנתא ובימי מילואים, ושלוש חברות הדירוג הורידו את דירוג ישראל תוך שהן מצביעות על הפוליטיקה הקואליציונית ועל דחיית התקציב כגורמי סיכון (בנק ישראל, 2025, עמ' 128). בשנת בחירות, שקיפות תקציבית עשויה להפוך לנכס פוליטי. הרפורמות בעלות הסיכוי הגבוה ביותר הן אלה שאינן מחייבות את הממשלה לוותר על כוח, אלא על סודיות בלבד: פרסום מוקדם של העברות תקציביות, סעיף נפרד לכספים קואליציוניים והקמת יחידת אומדנים עצמאית בכנסת. ארגוני חברה אזרחית יכולים לקדם אותן גם מול ממשלה עוינת, משום שקשה להתנגד להן בפומבי.</w:t>
       </w:r>
     </w:p>
     <w:p>
@@ -1039,48 +1039,6 @@
           <w:rtl/>
         </w:rPr>
         <w:t xml:space="preserve"> [מצגת הרצאה]. סוגיות בכלכלה וחברה, המרכז האקדמי פרס.</w:t>
-      </w:r>
-    </w:p>
-    <w:p>
-      <w:pPr>
-        <w:bidi/>
-        <w:spacing w:after="120" w:line="360" w:lineRule="auto"/>
-        <w:ind w:left="709" w:hanging="709"/>
-        <w:jc w:val="right"/>
-      </w:pPr>
-      <w:r>
-        <w:rPr>
-          <w:rFonts w:ascii="David" w:cs="David" w:eastAsia="David" w:hAnsi="David"/>
-          <w:b w:val="false"/>
-          <w:i w:val="false"/>
-          <w:sz w:val="24"/>
-          <w:szCs w:val="24"/>
-          <w:rtl/>
-        </w:rPr>
-        <w:t xml:space="preserve">מרכז המחקר והמידע של הכנסת. (2024). </w:t>
-      </w:r>
-      <w:r>
-        <w:rPr>
-          <w:rFonts w:ascii="David" w:cs="David" w:eastAsia="David" w:hAnsi="David"/>
-          <w:b w:val="false"/>
-          <w:i/>
-          <w:iCs/>
-          <w:sz w:val="24"/>
-          <w:szCs w:val="24"/>
-          <w:rtl/>
-        </w:rPr>
-        <w:t xml:space="preserve">התפתחות הגירעון התקציבי בשנת 2024 ובשנים הבאות</w:t>
-      </w:r>
-      <w:r>
-        <w:rPr>
-          <w:rFonts w:ascii="David" w:cs="David" w:eastAsia="David" w:hAnsi="David"/>
-          <w:b w:val="false"/>
-          <w:i w:val="false"/>
-          <w:sz w:val="24"/>
-          <w:szCs w:val="24"/>
-          <w:rtl/>
-        </w:rPr>
-        <w:t xml:space="preserve"> [מסמך רקע]. הכנסת. https://fs.knesset.gov.il/globaldocs/MMM/4eff0a9c-13f7-ee11-8162-005056aa4246/2_4eff0a9c-13f7-ee11-8162-005056aa4246_11_20592.pdf</w:t>
       </w:r>
     </w:p>
     <w:p>

</xml_diff>